<commit_message>
Update client form: licence details confirmed, remaining questions only
Co-Authored-By: Claude Opus 5.5 <noreply@anthropic.com>
Claude-Session: https://claude.ai/code/session_01Nb24wkBWXqpaMd15a8EnZi
</commit_message>
<xml_diff>
--- a/docs/BAB-AL-HIDAYA-Website-Information-Form.docx
+++ b/docs/BAB-AL-HIDAYA-Website-Information-Form.docx
@@ -11,9 +11,9 @@
           <w:b/>
           <w:i w:val="0"/>
           <w:color w:val="0B2545"/>
-          <w:sz w:val="36"/>
+          <w:sz w:val="34"/>
         </w:rPr>
-        <w:t>BAB AL HIDAYA CLEANING SERVICES SPS LLC</w:t>
+        <w:t>BAB AL HIDAYA CLEANING SERVICES (S.P.S - L.L.C)</w:t>
       </w:r>
     </w:p>
     <w:p>
@@ -27,7 +27,7 @@
           <w:color w:val="C9A227"/>
           <w:sz w:val="22"/>
         </w:rPr>
-        <w:t>Website information form  ·  نموذج معلومات الموقع الإلكتروني</w:t>
+        <w:t>Website information form, version 2  ·  نموذج معلومات الموقع الإلكتروني</w:t>
       </w:r>
     </w:p>
     <w:p>
@@ -54,7 +54,7 @@
           <w:i w:val="0"/>
           <w:sz w:val="19"/>
         </w:rPr>
-        <w:t>•  Type your answer in the yellow “Your answer” column.</w:t>
+        <w:t>•  The details from your trade licence are already on the website. Please check the “Confirmed” table below.</w:t>
       </w:r>
     </w:p>
     <w:p>
@@ -67,7 +67,7 @@
           <w:i w:val="0"/>
           <w:sz w:val="19"/>
         </w:rPr>
-        <w:t>•  Required = needed before the website goes live.  Optional = nice to have; leave blank if you prefer.</w:t>
+        <w:t>•  Type your answers in the yellow column. Required = needed before launch. Optional = nice to have.</w:t>
       </w:r>
     </w:p>
     <w:p>
@@ -93,7 +93,7 @@
           <w:i w:val="0"/>
           <w:sz w:val="19"/>
         </w:rPr>
-        <w:t>•  Where a document is requested, you can simply send a copy on WhatsApp/email instead of typing.</w:t>
+        <w:t>•  You can send documents or photos on WhatsApp/email instead of typing.</w:t>
       </w:r>
     </w:p>
     <w:p>
@@ -106,7 +106,7 @@
           <w:i w:val="0"/>
           <w:sz w:val="19"/>
         </w:rPr>
-        <w:t>•  Licences, approvals or certificates the company does not actually hold will be removed from the website. Please confirm only what is real.</w:t>
+        <w:t>•  The company is newly registered (August 2026), so the website only shows what is real: no invented years, staff numbers, projects or certificates. Sections for approvals, ISO, insurance, projects and reviews stay hidden until you provide them.</w:t>
       </w:r>
     </w:p>
     <w:p>
@@ -122,7 +122,21 @@
           <w:color w:val="0B2545"/>
           <w:sz w:val="26"/>
         </w:rPr>
-        <w:t>Already confirmed ✔</w:t>
+        <w:t>Confirmed from the trade licence ✔</w:t>
+      </w:r>
+    </w:p>
+    <w:p>
+      <w:pPr>
+        <w:spacing w:after="80"/>
+      </w:pPr>
+      <w:r>
+        <w:rPr>
+          <w:b w:val="0"/>
+          <w:i/>
+          <w:color w:val="5A6778"/>
+          <w:sz w:val="18"/>
+        </w:rPr>
+        <w:t>Taken from the Ajman DED licence pack (printed 02-09-2026). Please tick Yes, or correct anything that is wrong.</w:t>
       </w:r>
     </w:p>
     <w:tbl>
@@ -140,7 +154,7 @@
       <w:tr>
         <w:tc>
           <w:tcPr>
-            <w:tcW w:type="dxa" w:w="1984"/>
+            <w:tcW w:type="dxa" w:w="2041"/>
             <w:shd w:val="clear" w:color="auto" w:fill="0B2545"/>
           </w:tcPr>
           <w:p>
@@ -157,7 +171,7 @@
         </w:tc>
         <w:tc>
           <w:tcPr>
-            <w:tcW w:type="dxa" w:w="5386"/>
+            <w:tcW w:type="dxa" w:w="5443"/>
             <w:shd w:val="clear" w:color="auto" w:fill="0B2545"/>
           </w:tcPr>
           <w:p>
@@ -174,7 +188,7 @@
         </w:tc>
         <w:tc>
           <w:tcPr>
-            <w:tcW w:type="dxa" w:w="2494"/>
+            <w:tcW w:type="dxa" w:w="2381"/>
             <w:shd w:val="clear" w:color="auto" w:fill="0B2545"/>
           </w:tcPr>
           <w:p>
@@ -193,7 +207,7 @@
       <w:tr>
         <w:tc>
           <w:tcPr>
-            <w:tcW w:type="dxa" w:w="1984"/>
+            <w:tcW w:type="dxa" w:w="2041"/>
           </w:tcPr>
           <w:p>
             <w:r/>
@@ -201,13 +215,13 @@
               <w:rPr>
                 <w:sz w:val="19"/>
               </w:rPr>
-              <w:t>Company name</w:t>
-            </w:r>
-          </w:p>
-        </w:tc>
-        <w:tc>
-          <w:tcPr>
-            <w:tcW w:type="dxa" w:w="5386"/>
+              <w:t>Trade name (English)</w:t>
+            </w:r>
+          </w:p>
+        </w:tc>
+        <w:tc>
+          <w:tcPr>
+            <w:tcW w:type="dxa" w:w="5443"/>
           </w:tcPr>
           <w:p>
             <w:r/>
@@ -215,13 +229,13 @@
               <w:rPr>
                 <w:sz w:val="19"/>
               </w:rPr>
-              <w:t>BAB AL HIDAYA CLEANING SERVICES SPS LLC</w:t>
-            </w:r>
-          </w:p>
-        </w:tc>
-        <w:tc>
-          <w:tcPr>
-            <w:tcW w:type="dxa" w:w="2494"/>
+              <w:t>BAB AL HIDAYA CLEANING SERVICES (S.P.S - L.L.C)</w:t>
+            </w:r>
+          </w:p>
+        </w:tc>
+        <w:tc>
+          <w:tcPr>
+            <w:tcW w:type="dxa" w:w="2381"/>
             <w:shd w:val="clear" w:color="auto" w:fill="FFFBEA"/>
           </w:tcPr>
           <w:p>
@@ -238,7 +252,7 @@
       <w:tr>
         <w:tc>
           <w:tcPr>
-            <w:tcW w:type="dxa" w:w="1984"/>
+            <w:tcW w:type="dxa" w:w="2041"/>
           </w:tcPr>
           <w:p>
             <w:r/>
@@ -246,13 +260,13 @@
               <w:rPr>
                 <w:sz w:val="19"/>
               </w:rPr>
-              <w:t>Registered in</w:t>
-            </w:r>
-          </w:p>
-        </w:tc>
-        <w:tc>
-          <w:tcPr>
-            <w:tcW w:type="dxa" w:w="5386"/>
+              <w:t>Trade name (Arabic)</w:t>
+            </w:r>
+          </w:p>
+        </w:tc>
+        <w:tc>
+          <w:tcPr>
+            <w:tcW w:type="dxa" w:w="5443"/>
           </w:tcPr>
           <w:p>
             <w:r/>
@@ -260,13 +274,13 @@
               <w:rPr>
                 <w:sz w:val="19"/>
               </w:rPr>
-              <w:t>Ajman, UAE</w:t>
-            </w:r>
-          </w:p>
-        </w:tc>
-        <w:tc>
-          <w:tcPr>
-            <w:tcW w:type="dxa" w:w="2494"/>
+              <w:t>باب الهداية لخدمات التنظيف (ش.ش.و - ذ.م.م)</w:t>
+            </w:r>
+          </w:p>
+        </w:tc>
+        <w:tc>
+          <w:tcPr>
+            <w:tcW w:type="dxa" w:w="2381"/>
             <w:shd w:val="clear" w:color="auto" w:fill="FFFBEA"/>
           </w:tcPr>
           <w:p>
@@ -283,7 +297,7 @@
       <w:tr>
         <w:tc>
           <w:tcPr>
-            <w:tcW w:type="dxa" w:w="1984"/>
+            <w:tcW w:type="dxa" w:w="2041"/>
           </w:tcPr>
           <w:p>
             <w:r/>
@@ -291,13 +305,13 @@
               <w:rPr>
                 <w:sz w:val="19"/>
               </w:rPr>
-              <w:t>Service area</w:t>
-            </w:r>
-          </w:p>
-        </w:tc>
-        <w:tc>
-          <w:tcPr>
-            <w:tcW w:type="dxa" w:w="5386"/>
+              <w:t>Legal form</w:t>
+            </w:r>
+          </w:p>
+        </w:tc>
+        <w:tc>
+          <w:tcPr>
+            <w:tcW w:type="dxa" w:w="5443"/>
           </w:tcPr>
           <w:p>
             <w:r/>
@@ -305,13 +319,13 @@
               <w:rPr>
                 <w:sz w:val="19"/>
               </w:rPr>
-              <w:t>All over the UAE (all seven emirates)</w:t>
-            </w:r>
-          </w:p>
-        </w:tc>
-        <w:tc>
-          <w:tcPr>
-            <w:tcW w:type="dxa" w:w="2494"/>
+              <w:t>L.L.C (Sole Proprietorship)</w:t>
+            </w:r>
+          </w:p>
+        </w:tc>
+        <w:tc>
+          <w:tcPr>
+            <w:tcW w:type="dxa" w:w="2381"/>
             <w:shd w:val="clear" w:color="auto" w:fill="FFFBEA"/>
           </w:tcPr>
           <w:p>
@@ -328,7 +342,7 @@
       <w:tr>
         <w:tc>
           <w:tcPr>
-            <w:tcW w:type="dxa" w:w="1984"/>
+            <w:tcW w:type="dxa" w:w="2041"/>
           </w:tcPr>
           <w:p>
             <w:r/>
@@ -336,13 +350,13 @@
               <w:rPr>
                 <w:sz w:val="19"/>
               </w:rPr>
-              <w:t>Staffing options</w:t>
-            </w:r>
-          </w:p>
-        </w:tc>
-        <w:tc>
-          <w:tcPr>
-            <w:tcW w:type="dxa" w:w="5386"/>
+              <w:t>Licence</w:t>
+            </w:r>
+          </w:p>
+        </w:tc>
+        <w:tc>
+          <w:tcPr>
+            <w:tcW w:type="dxa" w:w="5443"/>
           </w:tcPr>
           <w:p>
             <w:r/>
@@ -350,13 +364,13 @@
               <w:rPr>
                 <w:sz w:val="19"/>
               </w:rPr>
-              <w:t>Cleaners and maintenance experts on hourly, daily, weekly and monthly basis</w:t>
-            </w:r>
-          </w:p>
-        </w:tc>
-        <w:tc>
-          <w:tcPr>
-            <w:tcW w:type="dxa" w:w="2494"/>
+              <w:t>Professional licence No. 140351, Ajman Department of Economic Development</w:t>
+            </w:r>
+          </w:p>
+        </w:tc>
+        <w:tc>
+          <w:tcPr>
+            <w:tcW w:type="dxa" w:w="2381"/>
             <w:shd w:val="clear" w:color="auto" w:fill="FFFBEA"/>
           </w:tcPr>
           <w:p>
@@ -373,7 +387,7 @@
       <w:tr>
         <w:tc>
           <w:tcPr>
-            <w:tcW w:type="dxa" w:w="1984"/>
+            <w:tcW w:type="dxa" w:w="2041"/>
           </w:tcPr>
           <w:p>
             <w:r/>
@@ -381,13 +395,373 @@
               <w:rPr>
                 <w:sz w:val="19"/>
               </w:rPr>
+              <w:t>Licence dates</w:t>
+            </w:r>
+          </w:p>
+        </w:tc>
+        <w:tc>
+          <w:tcPr>
+            <w:tcW w:type="dxa" w:w="5443"/>
+          </w:tcPr>
+          <w:p>
+            <w:r/>
+            <w:r>
+              <w:rPr>
+                <w:sz w:val="19"/>
+              </w:rPr>
+              <w:t>Issued 19-08-2026 · Expires 18-08-2027</w:t>
+            </w:r>
+          </w:p>
+        </w:tc>
+        <w:tc>
+          <w:tcPr>
+            <w:tcW w:type="dxa" w:w="2381"/>
+            <w:shd w:val="clear" w:color="auto" w:fill="FFFBEA"/>
+          </w:tcPr>
+          <w:p>
+            <w:r/>
+            <w:r>
+              <w:rPr>
+                <w:sz w:val="19"/>
+              </w:rPr>
+              <w:t xml:space="preserve">Yes / No: </w:t>
+            </w:r>
+          </w:p>
+        </w:tc>
+      </w:tr>
+      <w:tr>
+        <w:tc>
+          <w:tcPr>
+            <w:tcW w:type="dxa" w:w="2041"/>
+          </w:tcPr>
+          <w:p>
+            <w:r/>
+            <w:r>
+              <w:rPr>
+                <w:sz w:val="19"/>
+              </w:rPr>
+              <w:t>Commercial register no.</w:t>
+            </w:r>
+          </w:p>
+        </w:tc>
+        <w:tc>
+          <w:tcPr>
+            <w:tcW w:type="dxa" w:w="5443"/>
+          </w:tcPr>
+          <w:p>
+            <w:r/>
+            <w:r>
+              <w:rPr>
+                <w:sz w:val="19"/>
+              </w:rPr>
+              <w:t>201843804</w:t>
+            </w:r>
+          </w:p>
+        </w:tc>
+        <w:tc>
+          <w:tcPr>
+            <w:tcW w:type="dxa" w:w="2381"/>
+            <w:shd w:val="clear" w:color="auto" w:fill="FFFBEA"/>
+          </w:tcPr>
+          <w:p>
+            <w:r/>
+            <w:r>
+              <w:rPr>
+                <w:sz w:val="19"/>
+              </w:rPr>
+              <w:t xml:space="preserve">Yes / No: </w:t>
+            </w:r>
+          </w:p>
+        </w:tc>
+      </w:tr>
+      <w:tr>
+        <w:tc>
+          <w:tcPr>
+            <w:tcW w:type="dxa" w:w="2041"/>
+          </w:tcPr>
+          <w:p>
+            <w:r/>
+            <w:r>
+              <w:rPr>
+                <w:sz w:val="19"/>
+              </w:rPr>
+              <w:t>Ajman Chamber (ACCI) no.</w:t>
+            </w:r>
+          </w:p>
+        </w:tc>
+        <w:tc>
+          <w:tcPr>
+            <w:tcW w:type="dxa" w:w="5443"/>
+          </w:tcPr>
+          <w:p>
+            <w:r/>
+            <w:r>
+              <w:rPr>
+                <w:sz w:val="19"/>
+              </w:rPr>
+              <w:t>223220</w:t>
+            </w:r>
+          </w:p>
+        </w:tc>
+        <w:tc>
+          <w:tcPr>
+            <w:tcW w:type="dxa" w:w="2381"/>
+            <w:shd w:val="clear" w:color="auto" w:fill="FFFBEA"/>
+          </w:tcPr>
+          <w:p>
+            <w:r/>
+            <w:r>
+              <w:rPr>
+                <w:sz w:val="19"/>
+              </w:rPr>
+              <w:t xml:space="preserve">Yes / No: </w:t>
+            </w:r>
+          </w:p>
+        </w:tc>
+      </w:tr>
+      <w:tr>
+        <w:tc>
+          <w:tcPr>
+            <w:tcW w:type="dxa" w:w="2041"/>
+          </w:tcPr>
+          <w:p>
+            <w:r/>
+            <w:r>
+              <w:rPr>
+                <w:sz w:val="19"/>
+              </w:rPr>
+              <w:t>Licensed activities</w:t>
+            </w:r>
+          </w:p>
+        </w:tc>
+        <w:tc>
+          <w:tcPr>
+            <w:tcW w:type="dxa" w:w="5443"/>
+          </w:tcPr>
+          <w:p>
+            <w:r/>
+            <w:r>
+              <w:rPr>
+                <w:sz w:val="19"/>
+              </w:rPr>
+              <w:t>Buildings Maintenance · Buildings Cleaning (exterior / facades) · Buildings Cleaning (interior)</w:t>
+            </w:r>
+          </w:p>
+        </w:tc>
+        <w:tc>
+          <w:tcPr>
+            <w:tcW w:type="dxa" w:w="2381"/>
+            <w:shd w:val="clear" w:color="auto" w:fill="FFFBEA"/>
+          </w:tcPr>
+          <w:p>
+            <w:r/>
+            <w:r>
+              <w:rPr>
+                <w:sz w:val="19"/>
+              </w:rPr>
+              <w:t xml:space="preserve">Yes / No: </w:t>
+            </w:r>
+          </w:p>
+        </w:tc>
+      </w:tr>
+      <w:tr>
+        <w:tc>
+          <w:tcPr>
+            <w:tcW w:type="dxa" w:w="2041"/>
+          </w:tcPr>
+          <w:p>
+            <w:r/>
+            <w:r>
+              <w:rPr>
+                <w:sz w:val="19"/>
+              </w:rPr>
+              <w:t>Office address</w:t>
+            </w:r>
+          </w:p>
+        </w:tc>
+        <w:tc>
+          <w:tcPr>
+            <w:tcW w:type="dxa" w:w="5443"/>
+          </w:tcPr>
+          <w:p>
+            <w:r/>
+            <w:r>
+              <w:rPr>
+                <w:sz w:val="19"/>
+              </w:rPr>
+              <w:t>Office No. 109, Masfout 8, Ajman</w:t>
+            </w:r>
+          </w:p>
+        </w:tc>
+        <w:tc>
+          <w:tcPr>
+            <w:tcW w:type="dxa" w:w="2381"/>
+            <w:shd w:val="clear" w:color="auto" w:fill="FFFBEA"/>
+          </w:tcPr>
+          <w:p>
+            <w:r/>
+            <w:r>
+              <w:rPr>
+                <w:sz w:val="19"/>
+              </w:rPr>
+              <w:t xml:space="preserve">Yes / No: </w:t>
+            </w:r>
+          </w:p>
+        </w:tc>
+      </w:tr>
+      <w:tr>
+        <w:tc>
+          <w:tcPr>
+            <w:tcW w:type="dxa" w:w="2041"/>
+          </w:tcPr>
+          <w:p>
+            <w:r/>
+            <w:r>
+              <w:rPr>
+                <w:sz w:val="19"/>
+              </w:rPr>
+              <w:t>Owner &amp; manager</w:t>
+            </w:r>
+          </w:p>
+        </w:tc>
+        <w:tc>
+          <w:tcPr>
+            <w:tcW w:type="dxa" w:w="5443"/>
+          </w:tcPr>
+          <w:p>
+            <w:r/>
+            <w:r>
+              <w:rPr>
+                <w:sz w:val="19"/>
+              </w:rPr>
+              <w:t>Ankit Kumar Akhilesh Kumar (100% owner)</w:t>
+            </w:r>
+          </w:p>
+        </w:tc>
+        <w:tc>
+          <w:tcPr>
+            <w:tcW w:type="dxa" w:w="2381"/>
+            <w:shd w:val="clear" w:color="auto" w:fill="FFFBEA"/>
+          </w:tcPr>
+          <w:p>
+            <w:r/>
+            <w:r>
+              <w:rPr>
+                <w:sz w:val="19"/>
+              </w:rPr>
+              <w:t xml:space="preserve">Yes / No: </w:t>
+            </w:r>
+          </w:p>
+        </w:tc>
+      </w:tr>
+      <w:tr>
+        <w:tc>
+          <w:tcPr>
+            <w:tcW w:type="dxa" w:w="2041"/>
+          </w:tcPr>
+          <w:p>
+            <w:r/>
+            <w:r>
+              <w:rPr>
+                <w:sz w:val="19"/>
+              </w:rPr>
+              <w:t>Service area</w:t>
+            </w:r>
+          </w:p>
+        </w:tc>
+        <w:tc>
+          <w:tcPr>
+            <w:tcW w:type="dxa" w:w="5443"/>
+          </w:tcPr>
+          <w:p>
+            <w:r/>
+            <w:r>
+              <w:rPr>
+                <w:sz w:val="19"/>
+              </w:rPr>
+              <w:t>All over the UAE (all seven emirates)</w:t>
+            </w:r>
+          </w:p>
+        </w:tc>
+        <w:tc>
+          <w:tcPr>
+            <w:tcW w:type="dxa" w:w="2381"/>
+            <w:shd w:val="clear" w:color="auto" w:fill="FFFBEA"/>
+          </w:tcPr>
+          <w:p>
+            <w:r/>
+            <w:r>
+              <w:rPr>
+                <w:sz w:val="19"/>
+              </w:rPr>
+              <w:t xml:space="preserve">Yes / No: </w:t>
+            </w:r>
+          </w:p>
+        </w:tc>
+      </w:tr>
+      <w:tr>
+        <w:tc>
+          <w:tcPr>
+            <w:tcW w:type="dxa" w:w="2041"/>
+          </w:tcPr>
+          <w:p>
+            <w:r/>
+            <w:r>
+              <w:rPr>
+                <w:sz w:val="19"/>
+              </w:rPr>
+              <w:t>Staffing options</w:t>
+            </w:r>
+          </w:p>
+        </w:tc>
+        <w:tc>
+          <w:tcPr>
+            <w:tcW w:type="dxa" w:w="5443"/>
+          </w:tcPr>
+          <w:p>
+            <w:r/>
+            <w:r>
+              <w:rPr>
+                <w:sz w:val="19"/>
+              </w:rPr>
+              <w:t>Cleaners and maintenance experts on hourly, daily, weekly and monthly basis</w:t>
+            </w:r>
+          </w:p>
+        </w:tc>
+        <w:tc>
+          <w:tcPr>
+            <w:tcW w:type="dxa" w:w="2381"/>
+            <w:shd w:val="clear" w:color="auto" w:fill="FFFBEA"/>
+          </w:tcPr>
+          <w:p>
+            <w:r/>
+            <w:r>
+              <w:rPr>
+                <w:sz w:val="19"/>
+              </w:rPr>
+              <w:t xml:space="preserve">Yes / No: </w:t>
+            </w:r>
+          </w:p>
+        </w:tc>
+      </w:tr>
+      <w:tr>
+        <w:tc>
+          <w:tcPr>
+            <w:tcW w:type="dxa" w:w="2041"/>
+          </w:tcPr>
+          <w:p>
+            <w:r/>
+            <w:r>
+              <w:rPr>
+                <w:sz w:val="19"/>
+              </w:rPr>
               <w:t>Enquiries</w:t>
             </w:r>
           </w:p>
         </w:tc>
         <w:tc>
           <w:tcPr>
-            <w:tcW w:type="dxa" w:w="5386"/>
+            <w:tcW w:type="dxa" w:w="5443"/>
           </w:tcPr>
           <w:p>
             <w:r/>
@@ -395,13 +769,13 @@
               <w:rPr>
                 <w:sz w:val="19"/>
               </w:rPr>
-              <w:t>Customers ask for charges and quotations through the website (sent to WhatsApp / email)</w:t>
-            </w:r>
-          </w:p>
-        </w:tc>
-        <w:tc>
-          <w:tcPr>
-            <w:tcW w:type="dxa" w:w="2494"/>
+              <w:t>Customers ask for charges and quotations through the website (WhatsApp / email)</w:t>
+            </w:r>
+          </w:p>
+        </w:tc>
+        <w:tc>
+          <w:tcPr>
+            <w:tcW w:type="dxa" w:w="2381"/>
             <w:shd w:val="clear" w:color="auto" w:fill="FFFBEA"/>
           </w:tcPr>
           <w:p>
@@ -434,7 +808,7 @@
           <w:color w:val="0B2545"/>
           <w:sz w:val="26"/>
         </w:rPr>
-        <w:t>1. Trade licence &amp; legal details</w:t>
+        <w:t>1. Contact details (most important)</w:t>
       </w:r>
     </w:p>
     <w:p>
@@ -448,7 +822,7 @@
           <w:color w:val="5A6778"/>
           <w:sz w:val="18"/>
         </w:rPr>
-        <w:t>Easiest option: send a clear copy of the Trade Licence, VAT certificate and office tenancy contract. We will read the details from them.</w:t>
+        <w:t>The website currently shows placeholder numbers. These are needed before launch.</w:t>
       </w:r>
     </w:p>
     <w:tbl>
@@ -559,7 +933,16 @@
               <w:rPr>
                 <w:sz w:val="19"/>
               </w:rPr>
-              <w:t>Company name in Arabic exactly as on the licence</w:t>
+              <w:t>WhatsApp number for customer enquiries and quotations</w:t>
+            </w:r>
+            <w:r>
+              <w:rPr>
+                <w:i/>
+                <w:color w:val="5A6778"/>
+                <w:sz w:val="16"/>
+              </w:rPr>
+              <w:br/>
+              <w:t>Should it be the owner’s mobile registered with DED, or a separate business number?</w:t>
             </w:r>
           </w:p>
         </w:tc>
@@ -619,7 +1002,7 @@
               <w:rPr>
                 <w:sz w:val="19"/>
               </w:rPr>
-              <w:t>Trade licence number</w:t>
+              <w:t>Phone / landline number to show on the website</w:t>
             </w:r>
           </w:p>
         </w:tc>
@@ -679,7 +1062,7 @@
               <w:rPr>
                 <w:sz w:val="19"/>
               </w:rPr>
-              <w:t>Issuing authority</w:t>
+              <w:t>Email for enquiries</w:t>
             </w:r>
             <w:r>
               <w:rPr>
@@ -688,7 +1071,7 @@
                 <w:sz w:val="16"/>
               </w:rPr>
               <w:br/>
-              <w:t>e.g. Ajman Department of Economic Development, or a free zone such as Ajman Free Zone</w:t>
+              <w:t>A business email such as info@babalhidaya.ae is recommended; personal Gmail is not ideal for banks</w:t>
             </w:r>
           </w:p>
         </w:tc>
@@ -748,7 +1131,7 @@
               <w:rPr>
                 <w:sz w:val="19"/>
               </w:rPr>
-              <w:t>Licence issue date and expiry date</w:t>
+              <w:t>Email for job applications (or “same as above”)</w:t>
             </w:r>
           </w:p>
         </w:tc>
@@ -808,7 +1191,248 @@
               <w:rPr>
                 <w:sz w:val="19"/>
               </w:rPr>
-              <w:t>Activities listed on the licence</w:t>
+              <w:t>Google Maps location link for Office 109, Masfout 8</w:t>
+            </w:r>
+          </w:p>
+        </w:tc>
+        <w:tc>
+          <w:tcPr>
+            <w:tcW w:type="dxa" w:w="4082"/>
+            <w:shd w:val="clear" w:color="auto" w:fill="FFFBEA"/>
+          </w:tcPr>
+          <w:p>
+            <w:r/>
+            <w:r>
+              <w:rPr>
+                <w:sz w:val="19"/>
+              </w:rPr>
+            </w:r>
+          </w:p>
+        </w:tc>
+        <w:tc>
+          <w:tcPr>
+            <w:tcW w:type="dxa" w:w="1247"/>
+          </w:tcPr>
+          <w:p>
+            <w:r/>
+            <w:r>
+              <w:rPr>
+                <w:b/>
+                <w:color w:val="B42318"/>
+                <w:sz w:val="18"/>
+              </w:rPr>
+              <w:t>Required</w:t>
+            </w:r>
+          </w:p>
+        </w:tc>
+      </w:tr>
+      <w:tr>
+        <w:tc>
+          <w:tcPr>
+            <w:tcW w:type="dxa" w:w="567"/>
+          </w:tcPr>
+          <w:p>
+            <w:r/>
+            <w:r>
+              <w:rPr>
+                <w:sz w:val="19"/>
+              </w:rPr>
+              <w:t>1.6</w:t>
+            </w:r>
+          </w:p>
+        </w:tc>
+        <w:tc>
+          <w:tcPr>
+            <w:tcW w:type="dxa" w:w="3969"/>
+          </w:tcPr>
+          <w:p>
+            <w:r/>
+            <w:r>
+              <w:rPr>
+                <w:sz w:val="19"/>
+              </w:rPr>
+              <w:t>P.O. Box (the licence has none; write “None” if not applicable)</w:t>
+            </w:r>
+          </w:p>
+        </w:tc>
+        <w:tc>
+          <w:tcPr>
+            <w:tcW w:type="dxa" w:w="4082"/>
+            <w:shd w:val="clear" w:color="auto" w:fill="FFFBEA"/>
+          </w:tcPr>
+          <w:p>
+            <w:r/>
+            <w:r>
+              <w:rPr>
+                <w:sz w:val="19"/>
+              </w:rPr>
+            </w:r>
+          </w:p>
+        </w:tc>
+        <w:tc>
+          <w:tcPr>
+            <w:tcW w:type="dxa" w:w="1247"/>
+          </w:tcPr>
+          <w:p>
+            <w:r/>
+            <w:r>
+              <w:rPr>
+                <w:b/>
+                <w:color w:val="0F7C74"/>
+                <w:sz w:val="18"/>
+              </w:rPr>
+              <w:t>Optional</w:t>
+            </w:r>
+          </w:p>
+        </w:tc>
+      </w:tr>
+      <w:tr>
+        <w:tc>
+          <w:tcPr>
+            <w:tcW w:type="dxa" w:w="567"/>
+          </w:tcPr>
+          <w:p>
+            <w:r/>
+            <w:r>
+              <w:rPr>
+                <w:sz w:val="19"/>
+              </w:rPr>
+              <w:t>1.7</w:t>
+            </w:r>
+          </w:p>
+        </w:tc>
+        <w:tc>
+          <w:tcPr>
+            <w:tcW w:type="dxa" w:w="3969"/>
+          </w:tcPr>
+          <w:p>
+            <w:r/>
+            <w:r>
+              <w:rPr>
+                <w:sz w:val="19"/>
+              </w:rPr>
+              <w:t>Working days and hours</w:t>
+            </w:r>
+          </w:p>
+        </w:tc>
+        <w:tc>
+          <w:tcPr>
+            <w:tcW w:type="dxa" w:w="4082"/>
+            <w:shd w:val="clear" w:color="auto" w:fill="FFFBEA"/>
+          </w:tcPr>
+          <w:p>
+            <w:r/>
+            <w:r>
+              <w:rPr>
+                <w:sz w:val="19"/>
+              </w:rPr>
+            </w:r>
+          </w:p>
+        </w:tc>
+        <w:tc>
+          <w:tcPr>
+            <w:tcW w:type="dxa" w:w="1247"/>
+          </w:tcPr>
+          <w:p>
+            <w:r/>
+            <w:r>
+              <w:rPr>
+                <w:b/>
+                <w:color w:val="B42318"/>
+                <w:sz w:val="18"/>
+              </w:rPr>
+              <w:t>Required</w:t>
+            </w:r>
+          </w:p>
+        </w:tc>
+      </w:tr>
+      <w:tr>
+        <w:tc>
+          <w:tcPr>
+            <w:tcW w:type="dxa" w:w="567"/>
+          </w:tcPr>
+          <w:p>
+            <w:r/>
+            <w:r>
+              <w:rPr>
+                <w:sz w:val="19"/>
+              </w:rPr>
+              <w:t>1.8</w:t>
+            </w:r>
+          </w:p>
+        </w:tc>
+        <w:tc>
+          <w:tcPr>
+            <w:tcW w:type="dxa" w:w="3969"/>
+          </w:tcPr>
+          <w:p>
+            <w:r/>
+            <w:r>
+              <w:rPr>
+                <w:sz w:val="19"/>
+              </w:rPr>
+              <w:t>Do you offer a 24/7 or emergency service? For which services?</w:t>
+            </w:r>
+          </w:p>
+        </w:tc>
+        <w:tc>
+          <w:tcPr>
+            <w:tcW w:type="dxa" w:w="4082"/>
+            <w:shd w:val="clear" w:color="auto" w:fill="FFFBEA"/>
+          </w:tcPr>
+          <w:p>
+            <w:r/>
+            <w:r>
+              <w:rPr>
+                <w:sz w:val="19"/>
+              </w:rPr>
+              <w:t xml:space="preserve">Yes / No: </w:t>
+            </w:r>
+          </w:p>
+        </w:tc>
+        <w:tc>
+          <w:tcPr>
+            <w:tcW w:type="dxa" w:w="1247"/>
+          </w:tcPr>
+          <w:p>
+            <w:r/>
+            <w:r>
+              <w:rPr>
+                <w:b/>
+                <w:color w:val="B42318"/>
+                <w:sz w:val="18"/>
+              </w:rPr>
+              <w:t>Required</w:t>
+            </w:r>
+          </w:p>
+        </w:tc>
+      </w:tr>
+      <w:tr>
+        <w:tc>
+          <w:tcPr>
+            <w:tcW w:type="dxa" w:w="567"/>
+          </w:tcPr>
+          <w:p>
+            <w:r/>
+            <w:r>
+              <w:rPr>
+                <w:sz w:val="19"/>
+              </w:rPr>
+              <w:t>1.9</w:t>
+            </w:r>
+          </w:p>
+        </w:tc>
+        <w:tc>
+          <w:tcPr>
+            <w:tcW w:type="dxa" w:w="3969"/>
+          </w:tcPr>
+          <w:p>
+            <w:r/>
+            <w:r>
+              <w:rPr>
+                <w:sz w:val="19"/>
+              </w:rPr>
+              <w:t>Social media links and Google Business listing</w:t>
             </w:r>
             <w:r>
               <w:rPr>
@@ -817,187 +1441,7 @@
                 <w:sz w:val="16"/>
               </w:rPr>
               <w:br/>
-              <w:t>copy the list, e.g. building cleaning, maintenance…</w:t>
-            </w:r>
-          </w:p>
-        </w:tc>
-        <w:tc>
-          <w:tcPr>
-            <w:tcW w:type="dxa" w:w="4082"/>
-            <w:shd w:val="clear" w:color="auto" w:fill="FFFBEA"/>
-          </w:tcPr>
-          <w:p>
-            <w:r/>
-            <w:r>
-              <w:rPr>
-                <w:sz w:val="19"/>
-              </w:rPr>
-            </w:r>
-          </w:p>
-        </w:tc>
-        <w:tc>
-          <w:tcPr>
-            <w:tcW w:type="dxa" w:w="1247"/>
-          </w:tcPr>
-          <w:p>
-            <w:r/>
-            <w:r>
-              <w:rPr>
-                <w:b/>
-                <w:color w:val="B42318"/>
-                <w:sz w:val="18"/>
-              </w:rPr>
-              <w:t>Required</w:t>
-            </w:r>
-          </w:p>
-        </w:tc>
-      </w:tr>
-      <w:tr>
-        <w:tc>
-          <w:tcPr>
-            <w:tcW w:type="dxa" w:w="567"/>
-          </w:tcPr>
-          <w:p>
-            <w:r/>
-            <w:r>
-              <w:rPr>
-                <w:sz w:val="19"/>
-              </w:rPr>
-              <w:t>1.6</w:t>
-            </w:r>
-          </w:p>
-        </w:tc>
-        <w:tc>
-          <w:tcPr>
-            <w:tcW w:type="dxa" w:w="3969"/>
-          </w:tcPr>
-          <w:p>
-            <w:r/>
-            <w:r>
-              <w:rPr>
-                <w:sz w:val="19"/>
-              </w:rPr>
-              <w:t>Year the company was established</w:t>
-            </w:r>
-          </w:p>
-        </w:tc>
-        <w:tc>
-          <w:tcPr>
-            <w:tcW w:type="dxa" w:w="4082"/>
-            <w:shd w:val="clear" w:color="auto" w:fill="FFFBEA"/>
-          </w:tcPr>
-          <w:p>
-            <w:r/>
-            <w:r>
-              <w:rPr>
-                <w:sz w:val="19"/>
-              </w:rPr>
-            </w:r>
-          </w:p>
-        </w:tc>
-        <w:tc>
-          <w:tcPr>
-            <w:tcW w:type="dxa" w:w="1247"/>
-          </w:tcPr>
-          <w:p>
-            <w:r/>
-            <w:r>
-              <w:rPr>
-                <w:b/>
-                <w:color w:val="B42318"/>
-                <w:sz w:val="18"/>
-              </w:rPr>
-              <w:t>Required</w:t>
-            </w:r>
-          </w:p>
-        </w:tc>
-      </w:tr>
-      <w:tr>
-        <w:tc>
-          <w:tcPr>
-            <w:tcW w:type="dxa" w:w="567"/>
-          </w:tcPr>
-          <w:p>
-            <w:r/>
-            <w:r>
-              <w:rPr>
-                <w:sz w:val="19"/>
-              </w:rPr>
-              <w:t>1.7</w:t>
-            </w:r>
-          </w:p>
-        </w:tc>
-        <w:tc>
-          <w:tcPr>
-            <w:tcW w:type="dxa" w:w="3969"/>
-          </w:tcPr>
-          <w:p>
-            <w:r/>
-            <w:r>
-              <w:rPr>
-                <w:sz w:val="19"/>
-              </w:rPr>
-              <w:t>VAT registration number (TRN, 15 digits), or “Not VAT registered”</w:t>
-            </w:r>
-          </w:p>
-        </w:tc>
-        <w:tc>
-          <w:tcPr>
-            <w:tcW w:type="dxa" w:w="4082"/>
-            <w:shd w:val="clear" w:color="auto" w:fill="FFFBEA"/>
-          </w:tcPr>
-          <w:p>
-            <w:r/>
-            <w:r>
-              <w:rPr>
-                <w:sz w:val="19"/>
-              </w:rPr>
-            </w:r>
-          </w:p>
-        </w:tc>
-        <w:tc>
-          <w:tcPr>
-            <w:tcW w:type="dxa" w:w="1247"/>
-          </w:tcPr>
-          <w:p>
-            <w:r/>
-            <w:r>
-              <w:rPr>
-                <w:b/>
-                <w:color w:val="B42318"/>
-                <w:sz w:val="18"/>
-              </w:rPr>
-              <w:t>Required</w:t>
-            </w:r>
-          </w:p>
-        </w:tc>
-      </w:tr>
-      <w:tr>
-        <w:tc>
-          <w:tcPr>
-            <w:tcW w:type="dxa" w:w="567"/>
-          </w:tcPr>
-          <w:p>
-            <w:r/>
-            <w:r>
-              <w:rPr>
-                <w:sz w:val="19"/>
-              </w:rPr>
-              <w:t>1.8</w:t>
-            </w:r>
-          </w:p>
-        </w:tc>
-        <w:tc>
-          <w:tcPr>
-            <w:tcW w:type="dxa" w:w="3969"/>
-          </w:tcPr>
-          <w:p>
-            <w:r/>
-            <w:r>
-              <w:rPr>
-                <w:sz w:val="19"/>
-              </w:rPr>
-              <w:t>Ajman Chamber of Commerce membership number</w:t>
+              <w:t>Instagram, Facebook, LinkedIn, TikTok</w:t>
             </w:r>
           </w:p>
         </w:tc>
@@ -1051,21 +1495,7 @@
           <w:color w:val="0B2545"/>
           <w:sz w:val="26"/>
         </w:rPr>
-        <w:t>2. Approvals, certificates &amp; insurance</w:t>
-      </w:r>
-    </w:p>
-    <w:p>
-      <w:pPr>
-        <w:spacing w:after="80"/>
-      </w:pPr>
-      <w:r>
-        <w:rPr>
-          <w:b w:val="0"/>
-          <w:i/>
-          <w:color w:val="5A6778"/>
-          <w:sz w:val="18"/>
-        </w:rPr>
-        <w:t>For each line write Yes (with reference number) or No. Only “Yes” items will be shown.</w:t>
+        <w:t>2. Remaining registrations</w:t>
       </w:r>
     </w:p>
     <w:tbl>
@@ -1176,7 +1606,7 @@
               <w:rPr>
                 <w:sz w:val="19"/>
               </w:rPr>
-              <w:t>Ajman Municipality (or other municipality) approval</w:t>
+              <w:t>VAT registration number (TRN), or “Not registered yet”</w:t>
             </w:r>
             <w:r>
               <w:rPr>
@@ -1185,7 +1615,7 @@
                 <w:sz w:val="16"/>
               </w:rPr>
               <w:br/>
-              <w:t>e.g. water tank cleaning, pest control</w:t>
+              <w:t>shown on the website only if provided</w:t>
             </w:r>
           </w:p>
         </w:tc>
@@ -1200,7 +1630,6 @@
               <w:rPr>
                 <w:sz w:val="19"/>
               </w:rPr>
-              <w:t xml:space="preserve">Yes / No, Ref no.: </w:t>
             </w:r>
           </w:p>
         </w:tc>
@@ -1246,7 +1675,16 @@
               <w:rPr>
                 <w:sz w:val="19"/>
               </w:rPr>
-              <w:t>Registered with MOHRE and salaries paid through WPS?</w:t>
+              <w:t>MOHRE establishment card: issued? (blank on the licence)</w:t>
+            </w:r>
+            <w:r>
+              <w:rPr>
+                <w:i/>
+                <w:color w:val="5A6778"/>
+                <w:sz w:val="16"/>
+              </w:rPr>
+              <w:br/>
+              <w:t>card number and quota not published, only “registered”</w:t>
             </w:r>
           </w:p>
         </w:tc>
@@ -1261,7 +1699,7 @@
               <w:rPr>
                 <w:sz w:val="19"/>
               </w:rPr>
-              <w:t xml:space="preserve">Yes / No: </w:t>
+              <w:t xml:space="preserve">Yes / No / In progress: </w:t>
             </w:r>
           </w:p>
         </w:tc>
@@ -1307,7 +1745,7 @@
               <w:rPr>
                 <w:sz w:val="19"/>
               </w:rPr>
-              <w:t>Civil Defence approval (fire alarm / fire-fighting maintenance)</w:t>
+              <w:t>ICP (Identity &amp; Citizenship) establishment card: issued?</w:t>
             </w:r>
           </w:p>
         </w:tc>
@@ -1322,7 +1760,7 @@
               <w:rPr>
                 <w:sz w:val="19"/>
               </w:rPr>
-              <w:t xml:space="preserve">Yes / No, Ref no.: </w:t>
+              <w:t xml:space="preserve">Yes / No / In progress: </w:t>
             </w:r>
           </w:p>
         </w:tc>
@@ -1368,7 +1806,190 @@
               <w:rPr>
                 <w:sz w:val="19"/>
               </w:rPr>
-              <w:t>ISO certificates (9001 Quality / 14001 Environment / 45001 Safety)</w:t>
+              <w:t>Municipality approvals (e.g. Ajman Municipality) held, with reference numbers</w:t>
+            </w:r>
+          </w:p>
+        </w:tc>
+        <w:tc>
+          <w:tcPr>
+            <w:tcW w:type="dxa" w:w="4082"/>
+            <w:shd w:val="clear" w:color="auto" w:fill="FFFBEA"/>
+          </w:tcPr>
+          <w:p>
+            <w:r/>
+            <w:r>
+              <w:rPr>
+                <w:sz w:val="19"/>
+              </w:rPr>
+              <w:t xml:space="preserve">Yes / No: </w:t>
+            </w:r>
+          </w:p>
+        </w:tc>
+        <w:tc>
+          <w:tcPr>
+            <w:tcW w:type="dxa" w:w="1247"/>
+          </w:tcPr>
+          <w:p>
+            <w:r/>
+            <w:r>
+              <w:rPr>
+                <w:b/>
+                <w:color w:val="0F7C74"/>
+                <w:sz w:val="18"/>
+              </w:rPr>
+              <w:t>Optional</w:t>
+            </w:r>
+          </w:p>
+        </w:tc>
+      </w:tr>
+      <w:tr>
+        <w:tc>
+          <w:tcPr>
+            <w:tcW w:type="dxa" w:w="567"/>
+          </w:tcPr>
+          <w:p>
+            <w:r/>
+            <w:r>
+              <w:rPr>
+                <w:sz w:val="19"/>
+              </w:rPr>
+              <w:t>2.5</w:t>
+            </w:r>
+          </w:p>
+        </w:tc>
+        <w:tc>
+          <w:tcPr>
+            <w:tcW w:type="dxa" w:w="3969"/>
+          </w:tcPr>
+          <w:p>
+            <w:r/>
+            <w:r>
+              <w:rPr>
+                <w:sz w:val="19"/>
+              </w:rPr>
+              <w:t>Civil Defence approval (fire systems)</w:t>
+            </w:r>
+          </w:p>
+        </w:tc>
+        <w:tc>
+          <w:tcPr>
+            <w:tcW w:type="dxa" w:w="4082"/>
+            <w:shd w:val="clear" w:color="auto" w:fill="FFFBEA"/>
+          </w:tcPr>
+          <w:p>
+            <w:r/>
+            <w:r>
+              <w:rPr>
+                <w:sz w:val="19"/>
+              </w:rPr>
+              <w:t xml:space="preserve">Yes / No: </w:t>
+            </w:r>
+          </w:p>
+        </w:tc>
+        <w:tc>
+          <w:tcPr>
+            <w:tcW w:type="dxa" w:w="1247"/>
+          </w:tcPr>
+          <w:p>
+            <w:r/>
+            <w:r>
+              <w:rPr>
+                <w:b/>
+                <w:color w:val="0F7C74"/>
+                <w:sz w:val="18"/>
+              </w:rPr>
+              <w:t>Optional</w:t>
+            </w:r>
+          </w:p>
+        </w:tc>
+      </w:tr>
+      <w:tr>
+        <w:tc>
+          <w:tcPr>
+            <w:tcW w:type="dxa" w:w="567"/>
+          </w:tcPr>
+          <w:p>
+            <w:r/>
+            <w:r>
+              <w:rPr>
+                <w:sz w:val="19"/>
+              </w:rPr>
+              <w:t>2.6</w:t>
+            </w:r>
+          </w:p>
+        </w:tc>
+        <w:tc>
+          <w:tcPr>
+            <w:tcW w:type="dxa" w:w="3969"/>
+          </w:tcPr>
+          <w:p>
+            <w:r/>
+            <w:r>
+              <w:rPr>
+                <w:sz w:val="19"/>
+              </w:rPr>
+              <w:t>ISO certificates (9001 / 14001 / 45001) and certifying company</w:t>
+            </w:r>
+          </w:p>
+        </w:tc>
+        <w:tc>
+          <w:tcPr>
+            <w:tcW w:type="dxa" w:w="4082"/>
+            <w:shd w:val="clear" w:color="auto" w:fill="FFFBEA"/>
+          </w:tcPr>
+          <w:p>
+            <w:r/>
+            <w:r>
+              <w:rPr>
+                <w:sz w:val="19"/>
+              </w:rPr>
+              <w:t xml:space="preserve">Yes / No: </w:t>
+            </w:r>
+          </w:p>
+        </w:tc>
+        <w:tc>
+          <w:tcPr>
+            <w:tcW w:type="dxa" w:w="1247"/>
+          </w:tcPr>
+          <w:p>
+            <w:r/>
+            <w:r>
+              <w:rPr>
+                <w:b/>
+                <w:color w:val="0F7C74"/>
+                <w:sz w:val="18"/>
+              </w:rPr>
+              <w:t>Optional</w:t>
+            </w:r>
+          </w:p>
+        </w:tc>
+      </w:tr>
+      <w:tr>
+        <w:tc>
+          <w:tcPr>
+            <w:tcW w:type="dxa" w:w="567"/>
+          </w:tcPr>
+          <w:p>
+            <w:r/>
+            <w:r>
+              <w:rPr>
+                <w:sz w:val="19"/>
+              </w:rPr>
+              <w:t>2.7</w:t>
+            </w:r>
+          </w:p>
+        </w:tc>
+        <w:tc>
+          <w:tcPr>
+            <w:tcW w:type="dxa" w:w="3969"/>
+          </w:tcPr>
+          <w:p>
+            <w:r/>
+            <w:r>
+              <w:rPr>
+                <w:sz w:val="19"/>
+              </w:rPr>
+              <w:t>Insurance</w:t>
             </w:r>
             <w:r>
               <w:rPr>
@@ -1377,7 +1998,7 @@
                 <w:sz w:val="16"/>
               </w:rPr>
               <w:br/>
-              <w:t>which ones, and the certifying company</w:t>
+              <w:t>third-party liability (cover amount), workmen’s compensation, staff medical, vehicles</w:t>
             </w:r>
           </w:p>
         </w:tc>
@@ -1423,7 +2044,7 @@
               <w:rPr>
                 <w:sz w:val="19"/>
               </w:rPr>
-              <w:t>2.5</w:t>
+              <w:t>2.8</w:t>
             </w:r>
           </w:p>
         </w:tc>
@@ -1437,76 +2058,7 @@
               <w:rPr>
                 <w:sz w:val="19"/>
               </w:rPr>
-              <w:t>Insurance</w:t>
-            </w:r>
-            <w:r>
-              <w:rPr>
-                <w:i/>
-                <w:color w:val="5A6778"/>
-                <w:sz w:val="16"/>
-              </w:rPr>
-              <w:br/>
-              <w:t>third-party liability (cover amount), workmen’s compensation, staff medical, vehicle insurance</w:t>
-            </w:r>
-          </w:p>
-        </w:tc>
-        <w:tc>
-          <w:tcPr>
-            <w:tcW w:type="dxa" w:w="4082"/>
-            <w:shd w:val="clear" w:color="auto" w:fill="FFFBEA"/>
-          </w:tcPr>
-          <w:p>
-            <w:r/>
-            <w:r>
-              <w:rPr>
-                <w:sz w:val="19"/>
-              </w:rPr>
-            </w:r>
-          </w:p>
-        </w:tc>
-        <w:tc>
-          <w:tcPr>
-            <w:tcW w:type="dxa" w:w="1247"/>
-          </w:tcPr>
-          <w:p>
-            <w:r/>
-            <w:r>
-              <w:rPr>
-                <w:b/>
-                <w:color w:val="0F7C74"/>
-                <w:sz w:val="18"/>
-              </w:rPr>
-              <w:t>Optional</w:t>
-            </w:r>
-          </w:p>
-        </w:tc>
-      </w:tr>
-      <w:tr>
-        <w:tc>
-          <w:tcPr>
-            <w:tcW w:type="dxa" w:w="567"/>
-          </w:tcPr>
-          <w:p>
-            <w:r/>
-            <w:r>
-              <w:rPr>
-                <w:sz w:val="19"/>
-              </w:rPr>
-              <w:t>2.6</w:t>
-            </w:r>
-          </w:p>
-        </w:tc>
-        <w:tc>
-          <w:tcPr>
-            <w:tcW w:type="dxa" w:w="3969"/>
-          </w:tcPr>
-          <w:p>
-            <w:r/>
-            <w:r>
-              <w:rPr>
-                <w:sz w:val="19"/>
-              </w:rPr>
-              <w:t>Registered as a vendor with any developer, government entity or large company?</w:t>
+              <w:t>Vendor registrations with developers, government entities or large companies</w:t>
             </w:r>
           </w:p>
         </w:tc>
@@ -1560,7 +2112,21 @@
           <w:color w:val="0B2545"/>
           <w:sz w:val="26"/>
         </w:rPr>
-        <w:t>3. Contact details</w:t>
+        <w:t>3. Services vs. licensed activities</w:t>
+      </w:r>
+    </w:p>
+    <w:p>
+      <w:pPr>
+        <w:spacing w:after="80"/>
+      </w:pPr>
+      <w:r>
+        <w:rPr>
+          <w:b w:val="0"/>
+          <w:i/>
+          <w:color w:val="5A6778"/>
+          <w:sz w:val="18"/>
+        </w:rPr>
+        <w:t>The licence covers building maintenance and interior/exterior building cleaning. Please confirm how these services are covered. Anything not covered will be removed or needs an extra licence activity.</w:t>
       </w:r>
     </w:p>
     <w:tbl>
@@ -1607,7 +2173,7 @@
                 <w:color w:val="FFFFFF"/>
                 <w:sz w:val="18"/>
               </w:rPr>
-              <w:t>Question</w:t>
+              <w:t>Service</w:t>
             </w:r>
           </w:p>
         </w:tc>
@@ -1624,7 +2190,7 @@
                 <w:color w:val="FFFFFF"/>
                 <w:sz w:val="18"/>
               </w:rPr>
-              <w:t>Your answer</w:t>
+              <w:t>Offered? / notes</w:t>
             </w:r>
           </w:p>
         </w:tc>
@@ -1671,7 +2237,16 @@
               <w:rPr>
                 <w:sz w:val="19"/>
               </w:rPr>
-              <w:t>Office address (office no., building, street, area, Ajman)</w:t>
+              <w:t>Supplying cleaners by the hour / day / week / month</w:t>
+            </w:r>
+            <w:r>
+              <w:rPr>
+                <w:i/>
+                <w:color w:val="5A6778"/>
+                <w:sz w:val="16"/>
+              </w:rPr>
+              <w:br/>
+              <w:t>confirm this is done under your cleaning activity (not a separate “labour supply” activity)</w:t>
             </w:r>
           </w:p>
         </w:tc>
@@ -1686,6 +2261,7 @@
               <w:rPr>
                 <w:sz w:val="19"/>
               </w:rPr>
+              <w:t xml:space="preserve">Yes / No: </w:t>
             </w:r>
           </w:p>
         </w:tc>
@@ -1731,7 +2307,338 @@
               <w:rPr>
                 <w:sz w:val="19"/>
               </w:rPr>
-              <w:t>P.O. Box</w:t>
+              <w:t>Maintenance technicians on hourly / daily / monthly basis</w:t>
+            </w:r>
+            <w:r>
+              <w:rPr>
+                <w:i/>
+                <w:color w:val="5A6778"/>
+                <w:sz w:val="16"/>
+              </w:rPr>
+              <w:br/>
+              <w:t>which trades? electrician, plumber, AC, handyman, painter…</w:t>
+            </w:r>
+          </w:p>
+        </w:tc>
+        <w:tc>
+          <w:tcPr>
+            <w:tcW w:type="dxa" w:w="4082"/>
+            <w:shd w:val="clear" w:color="auto" w:fill="FFFBEA"/>
+          </w:tcPr>
+          <w:p>
+            <w:r/>
+            <w:r>
+              <w:rPr>
+                <w:sz w:val="19"/>
+              </w:rPr>
+            </w:r>
+          </w:p>
+        </w:tc>
+        <w:tc>
+          <w:tcPr>
+            <w:tcW w:type="dxa" w:w="1247"/>
+          </w:tcPr>
+          <w:p>
+            <w:r/>
+            <w:r>
+              <w:rPr>
+                <w:b/>
+                <w:color w:val="B42318"/>
+                <w:sz w:val="18"/>
+              </w:rPr>
+              <w:t>Required</w:t>
+            </w:r>
+          </w:p>
+        </w:tc>
+      </w:tr>
+      <w:tr>
+        <w:tc>
+          <w:tcPr>
+            <w:tcW w:type="dxa" w:w="567"/>
+          </w:tcPr>
+          <w:p>
+            <w:r/>
+            <w:r>
+              <w:rPr>
+                <w:sz w:val="19"/>
+              </w:rPr>
+              <w:t>3.3</w:t>
+            </w:r>
+          </w:p>
+        </w:tc>
+        <w:tc>
+          <w:tcPr>
+            <w:tcW w:type="dxa" w:w="3969"/>
+          </w:tcPr>
+          <w:p>
+            <w:r/>
+            <w:r>
+              <w:rPr>
+                <w:sz w:val="19"/>
+              </w:rPr>
+              <w:t>AC servicing and duct cleaning (shown under building maintenance)</w:t>
+            </w:r>
+          </w:p>
+        </w:tc>
+        <w:tc>
+          <w:tcPr>
+            <w:tcW w:type="dxa" w:w="4082"/>
+            <w:shd w:val="clear" w:color="auto" w:fill="FFFBEA"/>
+          </w:tcPr>
+          <w:p>
+            <w:r/>
+            <w:r>
+              <w:rPr>
+                <w:sz w:val="19"/>
+              </w:rPr>
+              <w:t xml:space="preserve">Keep / Remove: </w:t>
+            </w:r>
+          </w:p>
+        </w:tc>
+        <w:tc>
+          <w:tcPr>
+            <w:tcW w:type="dxa" w:w="1247"/>
+          </w:tcPr>
+          <w:p>
+            <w:r/>
+            <w:r>
+              <w:rPr>
+                <w:b/>
+                <w:color w:val="B42318"/>
+                <w:sz w:val="18"/>
+              </w:rPr>
+              <w:t>Required</w:t>
+            </w:r>
+          </w:p>
+        </w:tc>
+      </w:tr>
+      <w:tr>
+        <w:tc>
+          <w:tcPr>
+            <w:tcW w:type="dxa" w:w="567"/>
+          </w:tcPr>
+          <w:p>
+            <w:r/>
+            <w:r>
+              <w:rPr>
+                <w:sz w:val="19"/>
+              </w:rPr>
+              <w:t>3.4</w:t>
+            </w:r>
+          </w:p>
+        </w:tc>
+        <w:tc>
+          <w:tcPr>
+            <w:tcW w:type="dxa" w:w="3969"/>
+          </w:tcPr>
+          <w:p>
+            <w:r/>
+            <w:r>
+              <w:rPr>
+                <w:sz w:val="19"/>
+              </w:rPr>
+              <w:t>Annual maintenance contracts (AMC) for buildings / villas</w:t>
+            </w:r>
+          </w:p>
+        </w:tc>
+        <w:tc>
+          <w:tcPr>
+            <w:tcW w:type="dxa" w:w="4082"/>
+            <w:shd w:val="clear" w:color="auto" w:fill="FFFBEA"/>
+          </w:tcPr>
+          <w:p>
+            <w:r/>
+            <w:r>
+              <w:rPr>
+                <w:sz w:val="19"/>
+              </w:rPr>
+              <w:t xml:space="preserve">Keep / Remove: </w:t>
+            </w:r>
+          </w:p>
+        </w:tc>
+        <w:tc>
+          <w:tcPr>
+            <w:tcW w:type="dxa" w:w="1247"/>
+          </w:tcPr>
+          <w:p>
+            <w:r/>
+            <w:r>
+              <w:rPr>
+                <w:b/>
+                <w:color w:val="B42318"/>
+                <w:sz w:val="18"/>
+              </w:rPr>
+              <w:t>Required</w:t>
+            </w:r>
+          </w:p>
+        </w:tc>
+      </w:tr>
+      <w:tr>
+        <w:tc>
+          <w:tcPr>
+            <w:tcW w:type="dxa" w:w="567"/>
+          </w:tcPr>
+          <w:p>
+            <w:r/>
+            <w:r>
+              <w:rPr>
+                <w:sz w:val="19"/>
+              </w:rPr>
+              <w:t>3.5</w:t>
+            </w:r>
+          </w:p>
+        </w:tc>
+        <w:tc>
+          <w:tcPr>
+            <w:tcW w:type="dxa" w:w="3969"/>
+          </w:tcPr>
+          <w:p>
+            <w:r/>
+            <w:r>
+              <w:rPr>
+                <w:sz w:val="19"/>
+              </w:rPr>
+              <w:t>Facade / window cleaning at height (rope access / cradle)</w:t>
+            </w:r>
+            <w:r>
+              <w:rPr>
+                <w:i/>
+                <w:color w:val="5A6778"/>
+                <w:sz w:val="16"/>
+              </w:rPr>
+              <w:br/>
+              <w:t>do you have trained, certified staff and equipment?</w:t>
+            </w:r>
+          </w:p>
+        </w:tc>
+        <w:tc>
+          <w:tcPr>
+            <w:tcW w:type="dxa" w:w="4082"/>
+            <w:shd w:val="clear" w:color="auto" w:fill="FFFBEA"/>
+          </w:tcPr>
+          <w:p>
+            <w:r/>
+            <w:r>
+              <w:rPr>
+                <w:sz w:val="19"/>
+              </w:rPr>
+              <w:t xml:space="preserve">Keep / Remove: </w:t>
+            </w:r>
+          </w:p>
+        </w:tc>
+        <w:tc>
+          <w:tcPr>
+            <w:tcW w:type="dxa" w:w="1247"/>
+          </w:tcPr>
+          <w:p>
+            <w:r/>
+            <w:r>
+              <w:rPr>
+                <w:b/>
+                <w:color w:val="B42318"/>
+                <w:sz w:val="18"/>
+              </w:rPr>
+              <w:t>Required</w:t>
+            </w:r>
+          </w:p>
+        </w:tc>
+      </w:tr>
+      <w:tr>
+        <w:tc>
+          <w:tcPr>
+            <w:tcW w:type="dxa" w:w="567"/>
+          </w:tcPr>
+          <w:p>
+            <w:r/>
+            <w:r>
+              <w:rPr>
+                <w:sz w:val="19"/>
+              </w:rPr>
+              <w:t>3.6</w:t>
+            </w:r>
+          </w:p>
+        </w:tc>
+        <w:tc>
+          <w:tcPr>
+            <w:tcW w:type="dxa" w:w="3969"/>
+          </w:tcPr>
+          <w:p>
+            <w:r/>
+            <w:r>
+              <w:rPr>
+                <w:sz w:val="19"/>
+              </w:rPr>
+              <w:t>Deep cleaning, move-in/out, post-construction, sofa/carpet cleaning</w:t>
+            </w:r>
+          </w:p>
+        </w:tc>
+        <w:tc>
+          <w:tcPr>
+            <w:tcW w:type="dxa" w:w="4082"/>
+            <w:shd w:val="clear" w:color="auto" w:fill="FFFBEA"/>
+          </w:tcPr>
+          <w:p>
+            <w:r/>
+            <w:r>
+              <w:rPr>
+                <w:sz w:val="19"/>
+              </w:rPr>
+              <w:t xml:space="preserve">Keep / Remove: </w:t>
+            </w:r>
+          </w:p>
+        </w:tc>
+        <w:tc>
+          <w:tcPr>
+            <w:tcW w:type="dxa" w:w="1247"/>
+          </w:tcPr>
+          <w:p>
+            <w:r/>
+            <w:r>
+              <w:rPr>
+                <w:b/>
+                <w:color w:val="B42318"/>
+                <w:sz w:val="18"/>
+              </w:rPr>
+              <w:t>Required</w:t>
+            </w:r>
+          </w:p>
+        </w:tc>
+      </w:tr>
+      <w:tr>
+        <w:tc>
+          <w:tcPr>
+            <w:tcW w:type="dxa" w:w="567"/>
+          </w:tcPr>
+          <w:p>
+            <w:r/>
+            <w:r>
+              <w:rPr>
+                <w:sz w:val="19"/>
+              </w:rPr>
+              <w:t>3.7</w:t>
+            </w:r>
+          </w:p>
+        </w:tc>
+        <w:tc>
+          <w:tcPr>
+            <w:tcW w:type="dxa" w:w="3969"/>
+          </w:tcPr>
+          <w:p>
+            <w:r/>
+            <w:r>
+              <w:rPr>
+                <w:sz w:val="19"/>
+              </w:rPr>
+              <w:t>Water tank cleaning / pest control / housemaids</w:t>
+            </w:r>
+            <w:r>
+              <w:rPr>
+                <w:i/>
+                <w:color w:val="5A6778"/>
+                <w:sz w:val="16"/>
+              </w:rPr>
+              <w:br/>
+              <w:t>removed from the website: these need extra licences or approvals. Do you hold them?</w:t>
             </w:r>
           </w:p>
         </w:tc>
@@ -1777,7 +2684,7 @@
               <w:rPr>
                 <w:sz w:val="19"/>
               </w:rPr>
-              <w:t>3.3</w:t>
+              <w:t>3.8</w:t>
             </w:r>
           </w:p>
         </w:tc>
@@ -1791,7 +2698,76 @@
               <w:rPr>
                 <w:sz w:val="19"/>
               </w:rPr>
-              <w:t>Google Maps location link of the office</w:t>
+              <w:t>Any other services you want listed?</w:t>
+            </w:r>
+          </w:p>
+        </w:tc>
+        <w:tc>
+          <w:tcPr>
+            <w:tcW w:type="dxa" w:w="4082"/>
+            <w:shd w:val="clear" w:color="auto" w:fill="FFFBEA"/>
+          </w:tcPr>
+          <w:p>
+            <w:r/>
+            <w:r>
+              <w:rPr>
+                <w:sz w:val="19"/>
+              </w:rPr>
+            </w:r>
+          </w:p>
+        </w:tc>
+        <w:tc>
+          <w:tcPr>
+            <w:tcW w:type="dxa" w:w="1247"/>
+          </w:tcPr>
+          <w:p>
+            <w:r/>
+            <w:r>
+              <w:rPr>
+                <w:b/>
+                <w:color w:val="0F7C74"/>
+                <w:sz w:val="18"/>
+              </w:rPr>
+              <w:t>Optional</w:t>
+            </w:r>
+          </w:p>
+        </w:tc>
+      </w:tr>
+      <w:tr>
+        <w:tc>
+          <w:tcPr>
+            <w:tcW w:type="dxa" w:w="567"/>
+          </w:tcPr>
+          <w:p>
+            <w:r/>
+            <w:r>
+              <w:rPr>
+                <w:sz w:val="19"/>
+              </w:rPr>
+              <w:t>3.9</w:t>
+            </w:r>
+          </w:p>
+        </w:tc>
+        <w:tc>
+          <w:tcPr>
+            <w:tcW w:type="dxa" w:w="3969"/>
+          </w:tcPr>
+          <w:p>
+            <w:r/>
+            <w:r>
+              <w:rPr>
+                <w:sz w:val="19"/>
+              </w:rPr>
+              <w:t>Main types of customers</w:t>
+            </w:r>
+            <w:r>
+              <w:rPr>
+                <w:i/>
+                <w:color w:val="5A6778"/>
+                <w:sz w:val="16"/>
+              </w:rPr>
+              <w:br/>
+              <w:t>homes/villas, offices, shops, towers, schools, hotels, clinics, warehouses</w:t>
             </w:r>
           </w:p>
         </w:tc>
@@ -1822,445 +2798,6 @@
                 <w:sz w:val="18"/>
               </w:rPr>
               <w:t>Required</w:t>
-            </w:r>
-          </w:p>
-        </w:tc>
-      </w:tr>
-      <w:tr>
-        <w:tc>
-          <w:tcPr>
-            <w:tcW w:type="dxa" w:w="567"/>
-          </w:tcPr>
-          <w:p>
-            <w:r/>
-            <w:r>
-              <w:rPr>
-                <w:sz w:val="19"/>
-              </w:rPr>
-              <w:t>3.4</w:t>
-            </w:r>
-          </w:p>
-        </w:tc>
-        <w:tc>
-          <w:tcPr>
-            <w:tcW w:type="dxa" w:w="3969"/>
-          </w:tcPr>
-          <w:p>
-            <w:r/>
-            <w:r>
-              <w:rPr>
-                <w:sz w:val="19"/>
-              </w:rPr>
-              <w:t>Landline number</w:t>
-            </w:r>
-          </w:p>
-        </w:tc>
-        <w:tc>
-          <w:tcPr>
-            <w:tcW w:type="dxa" w:w="4082"/>
-            <w:shd w:val="clear" w:color="auto" w:fill="FFFBEA"/>
-          </w:tcPr>
-          <w:p>
-            <w:r/>
-            <w:r>
-              <w:rPr>
-                <w:sz w:val="19"/>
-              </w:rPr>
-            </w:r>
-          </w:p>
-        </w:tc>
-        <w:tc>
-          <w:tcPr>
-            <w:tcW w:type="dxa" w:w="1247"/>
-          </w:tcPr>
-          <w:p>
-            <w:r/>
-            <w:r>
-              <w:rPr>
-                <w:b/>
-                <w:color w:val="0F7C74"/>
-                <w:sz w:val="18"/>
-              </w:rPr>
-              <w:t>Optional</w:t>
-            </w:r>
-          </w:p>
-        </w:tc>
-      </w:tr>
-      <w:tr>
-        <w:tc>
-          <w:tcPr>
-            <w:tcW w:type="dxa" w:w="567"/>
-          </w:tcPr>
-          <w:p>
-            <w:r/>
-            <w:r>
-              <w:rPr>
-                <w:sz w:val="19"/>
-              </w:rPr>
-              <w:t>3.5</w:t>
-            </w:r>
-          </w:p>
-        </w:tc>
-        <w:tc>
-          <w:tcPr>
-            <w:tcW w:type="dxa" w:w="3969"/>
-          </w:tcPr>
-          <w:p>
-            <w:r/>
-            <w:r>
-              <w:rPr>
-                <w:sz w:val="19"/>
-              </w:rPr>
-              <w:t>WhatsApp number for customer enquiries and quotations</w:t>
-            </w:r>
-          </w:p>
-        </w:tc>
-        <w:tc>
-          <w:tcPr>
-            <w:tcW w:type="dxa" w:w="4082"/>
-            <w:shd w:val="clear" w:color="auto" w:fill="FFFBEA"/>
-          </w:tcPr>
-          <w:p>
-            <w:r/>
-            <w:r>
-              <w:rPr>
-                <w:sz w:val="19"/>
-              </w:rPr>
-            </w:r>
-          </w:p>
-        </w:tc>
-        <w:tc>
-          <w:tcPr>
-            <w:tcW w:type="dxa" w:w="1247"/>
-          </w:tcPr>
-          <w:p>
-            <w:r/>
-            <w:r>
-              <w:rPr>
-                <w:b/>
-                <w:color w:val="B42318"/>
-                <w:sz w:val="18"/>
-              </w:rPr>
-              <w:t>Required</w:t>
-            </w:r>
-          </w:p>
-        </w:tc>
-      </w:tr>
-      <w:tr>
-        <w:tc>
-          <w:tcPr>
-            <w:tcW w:type="dxa" w:w="567"/>
-          </w:tcPr>
-          <w:p>
-            <w:r/>
-            <w:r>
-              <w:rPr>
-                <w:sz w:val="19"/>
-              </w:rPr>
-              <w:t>3.6</w:t>
-            </w:r>
-          </w:p>
-        </w:tc>
-        <w:tc>
-          <w:tcPr>
-            <w:tcW w:type="dxa" w:w="3969"/>
-          </w:tcPr>
-          <w:p>
-            <w:r/>
-            <w:r>
-              <w:rPr>
-                <w:sz w:val="19"/>
-              </w:rPr>
-              <w:t>Email for enquiries</w:t>
-            </w:r>
-            <w:r>
-              <w:rPr>
-                <w:i/>
-                <w:color w:val="5A6778"/>
-                <w:sz w:val="16"/>
-              </w:rPr>
-              <w:br/>
-              <w:t>e.g. info@babalhidaya.ae</w:t>
-            </w:r>
-          </w:p>
-        </w:tc>
-        <w:tc>
-          <w:tcPr>
-            <w:tcW w:type="dxa" w:w="4082"/>
-            <w:shd w:val="clear" w:color="auto" w:fill="FFFBEA"/>
-          </w:tcPr>
-          <w:p>
-            <w:r/>
-            <w:r>
-              <w:rPr>
-                <w:sz w:val="19"/>
-              </w:rPr>
-            </w:r>
-          </w:p>
-        </w:tc>
-        <w:tc>
-          <w:tcPr>
-            <w:tcW w:type="dxa" w:w="1247"/>
-          </w:tcPr>
-          <w:p>
-            <w:r/>
-            <w:r>
-              <w:rPr>
-                <w:b/>
-                <w:color w:val="B42318"/>
-                <w:sz w:val="18"/>
-              </w:rPr>
-              <w:t>Required</w:t>
-            </w:r>
-          </w:p>
-        </w:tc>
-      </w:tr>
-      <w:tr>
-        <w:tc>
-          <w:tcPr>
-            <w:tcW w:type="dxa" w:w="567"/>
-          </w:tcPr>
-          <w:p>
-            <w:r/>
-            <w:r>
-              <w:rPr>
-                <w:sz w:val="19"/>
-              </w:rPr>
-              <w:t>3.7</w:t>
-            </w:r>
-          </w:p>
-        </w:tc>
-        <w:tc>
-          <w:tcPr>
-            <w:tcW w:type="dxa" w:w="3969"/>
-          </w:tcPr>
-          <w:p>
-            <w:r/>
-            <w:r>
-              <w:rPr>
-                <w:sz w:val="19"/>
-              </w:rPr>
-              <w:t>Email for job applications (or “same as above”)</w:t>
-            </w:r>
-          </w:p>
-        </w:tc>
-        <w:tc>
-          <w:tcPr>
-            <w:tcW w:type="dxa" w:w="4082"/>
-            <w:shd w:val="clear" w:color="auto" w:fill="FFFBEA"/>
-          </w:tcPr>
-          <w:p>
-            <w:r/>
-            <w:r>
-              <w:rPr>
-                <w:sz w:val="19"/>
-              </w:rPr>
-            </w:r>
-          </w:p>
-        </w:tc>
-        <w:tc>
-          <w:tcPr>
-            <w:tcW w:type="dxa" w:w="1247"/>
-          </w:tcPr>
-          <w:p>
-            <w:r/>
-            <w:r>
-              <w:rPr>
-                <w:b/>
-                <w:color w:val="0F7C74"/>
-                <w:sz w:val="18"/>
-              </w:rPr>
-              <w:t>Optional</w:t>
-            </w:r>
-          </w:p>
-        </w:tc>
-      </w:tr>
-      <w:tr>
-        <w:tc>
-          <w:tcPr>
-            <w:tcW w:type="dxa" w:w="567"/>
-          </w:tcPr>
-          <w:p>
-            <w:r/>
-            <w:r>
-              <w:rPr>
-                <w:sz w:val="19"/>
-              </w:rPr>
-              <w:t>3.8</w:t>
-            </w:r>
-          </w:p>
-        </w:tc>
-        <w:tc>
-          <w:tcPr>
-            <w:tcW w:type="dxa" w:w="3969"/>
-          </w:tcPr>
-          <w:p>
-            <w:r/>
-            <w:r>
-              <w:rPr>
-                <w:sz w:val="19"/>
-              </w:rPr>
-              <w:t>Working days and hours</w:t>
-            </w:r>
-          </w:p>
-        </w:tc>
-        <w:tc>
-          <w:tcPr>
-            <w:tcW w:type="dxa" w:w="4082"/>
-            <w:shd w:val="clear" w:color="auto" w:fill="FFFBEA"/>
-          </w:tcPr>
-          <w:p>
-            <w:r/>
-            <w:r>
-              <w:rPr>
-                <w:sz w:val="19"/>
-              </w:rPr>
-            </w:r>
-          </w:p>
-        </w:tc>
-        <w:tc>
-          <w:tcPr>
-            <w:tcW w:type="dxa" w:w="1247"/>
-          </w:tcPr>
-          <w:p>
-            <w:r/>
-            <w:r>
-              <w:rPr>
-                <w:b/>
-                <w:color w:val="B42318"/>
-                <w:sz w:val="18"/>
-              </w:rPr>
-              <w:t>Required</w:t>
-            </w:r>
-          </w:p>
-        </w:tc>
-      </w:tr>
-      <w:tr>
-        <w:tc>
-          <w:tcPr>
-            <w:tcW w:type="dxa" w:w="567"/>
-          </w:tcPr>
-          <w:p>
-            <w:r/>
-            <w:r>
-              <w:rPr>
-                <w:sz w:val="19"/>
-              </w:rPr>
-              <w:t>3.9</w:t>
-            </w:r>
-          </w:p>
-        </w:tc>
-        <w:tc>
-          <w:tcPr>
-            <w:tcW w:type="dxa" w:w="3969"/>
-          </w:tcPr>
-          <w:p>
-            <w:r/>
-            <w:r>
-              <w:rPr>
-                <w:sz w:val="19"/>
-              </w:rPr>
-              <w:t>Is there a 24/7 or emergency service? For which services?</w:t>
-            </w:r>
-          </w:p>
-        </w:tc>
-        <w:tc>
-          <w:tcPr>
-            <w:tcW w:type="dxa" w:w="4082"/>
-            <w:shd w:val="clear" w:color="auto" w:fill="FFFBEA"/>
-          </w:tcPr>
-          <w:p>
-            <w:r/>
-            <w:r>
-              <w:rPr>
-                <w:sz w:val="19"/>
-              </w:rPr>
-              <w:t xml:space="preserve">Yes / No: </w:t>
-            </w:r>
-          </w:p>
-        </w:tc>
-        <w:tc>
-          <w:tcPr>
-            <w:tcW w:type="dxa" w:w="1247"/>
-          </w:tcPr>
-          <w:p>
-            <w:r/>
-            <w:r>
-              <w:rPr>
-                <w:b/>
-                <w:color w:val="B42318"/>
-                <w:sz w:val="18"/>
-              </w:rPr>
-              <w:t>Required</w:t>
-            </w:r>
-          </w:p>
-        </w:tc>
-      </w:tr>
-      <w:tr>
-        <w:tc>
-          <w:tcPr>
-            <w:tcW w:type="dxa" w:w="567"/>
-          </w:tcPr>
-          <w:p>
-            <w:r/>
-            <w:r>
-              <w:rPr>
-                <w:sz w:val="19"/>
-              </w:rPr>
-              <w:t>3.10</w:t>
-            </w:r>
-          </w:p>
-        </w:tc>
-        <w:tc>
-          <w:tcPr>
-            <w:tcW w:type="dxa" w:w="3969"/>
-          </w:tcPr>
-          <w:p>
-            <w:r/>
-            <w:r>
-              <w:rPr>
-                <w:sz w:val="19"/>
-              </w:rPr>
-              <w:t>Social media links and Google Business listing</w:t>
-            </w:r>
-            <w:r>
-              <w:rPr>
-                <w:i/>
-                <w:color w:val="5A6778"/>
-                <w:sz w:val="16"/>
-              </w:rPr>
-              <w:br/>
-              <w:t>Instagram, Facebook, LinkedIn, TikTok</w:t>
-            </w:r>
-          </w:p>
-        </w:tc>
-        <w:tc>
-          <w:tcPr>
-            <w:tcW w:type="dxa" w:w="4082"/>
-            <w:shd w:val="clear" w:color="auto" w:fill="FFFBEA"/>
-          </w:tcPr>
-          <w:p>
-            <w:r/>
-            <w:r>
-              <w:rPr>
-                <w:sz w:val="19"/>
-              </w:rPr>
-            </w:r>
-          </w:p>
-        </w:tc>
-        <w:tc>
-          <w:tcPr>
-            <w:tcW w:type="dxa" w:w="1247"/>
-          </w:tcPr>
-          <w:p>
-            <w:r/>
-            <w:r>
-              <w:rPr>
-                <w:b/>
-                <w:color w:val="0F7C74"/>
-                <w:sz w:val="18"/>
-              </w:rPr>
-              <w:t>Optional</w:t>
             </w:r>
           </w:p>
         </w:tc>
@@ -2284,699 +2821,7 @@
           <w:color w:val="0B2545"/>
           <w:sz w:val="26"/>
         </w:rPr>
-        <w:t>4. Services</w:t>
-      </w:r>
-    </w:p>
-    <w:p>
-      <w:pPr>
-        <w:spacing w:after="80"/>
-      </w:pPr>
-      <w:r>
-        <w:rPr>
-          <w:b w:val="0"/>
-          <w:i/>
-          <w:color w:val="5A6778"/>
-          <w:sz w:val="18"/>
-        </w:rPr>
-        <w:t>Mark each service Yes or No. Add missing services in 4.8.</w:t>
-      </w:r>
-    </w:p>
-    <w:tbl>
-      <w:tblPr>
-        <w:tblStyle w:val="TableGrid"/>
-        <w:tblW w:type="auto" w:w="0"/>
-        <w:jc w:val="center"/>
-        <w:tblLook w:firstColumn="1" w:firstRow="1" w:lastColumn="0" w:lastRow="0" w:noHBand="0" w:noVBand="1" w:val="04A0"/>
-      </w:tblPr>
-      <w:tblGrid>
-        <w:gridCol w:w="2550"/>
-        <w:gridCol w:w="2550"/>
-        <w:gridCol w:w="2550"/>
-        <w:gridCol w:w="2550"/>
-      </w:tblGrid>
-      <w:tr>
-        <w:tc>
-          <w:tcPr>
-            <w:tcW w:type="dxa" w:w="567"/>
-            <w:shd w:val="clear" w:color="auto" w:fill="0B2545"/>
-          </w:tcPr>
-          <w:p>
-            <w:r/>
-            <w:r>
-              <w:rPr>
-                <w:b/>
-                <w:color w:val="FFFFFF"/>
-                <w:sz w:val="18"/>
-              </w:rPr>
-              <w:t>#</w:t>
-            </w:r>
-          </w:p>
-        </w:tc>
-        <w:tc>
-          <w:tcPr>
-            <w:tcW w:type="dxa" w:w="3969"/>
-            <w:shd w:val="clear" w:color="auto" w:fill="0B2545"/>
-          </w:tcPr>
-          <w:p>
-            <w:r/>
-            <w:r>
-              <w:rPr>
-                <w:b/>
-                <w:color w:val="FFFFFF"/>
-                <w:sz w:val="18"/>
-              </w:rPr>
-              <w:t>Service</w:t>
-            </w:r>
-          </w:p>
-        </w:tc>
-        <w:tc>
-          <w:tcPr>
-            <w:tcW w:type="dxa" w:w="4082"/>
-            <w:shd w:val="clear" w:color="auto" w:fill="0B2545"/>
-          </w:tcPr>
-          <w:p>
-            <w:r/>
-            <w:r>
-              <w:rPr>
-                <w:b/>
-                <w:color w:val="FFFFFF"/>
-                <w:sz w:val="18"/>
-              </w:rPr>
-              <w:t>Offered? / notes</w:t>
-            </w:r>
-          </w:p>
-        </w:tc>
-        <w:tc>
-          <w:tcPr>
-            <w:tcW w:type="dxa" w:w="1247"/>
-            <w:shd w:val="clear" w:color="auto" w:fill="0B2545"/>
-          </w:tcPr>
-          <w:p>
-            <w:r/>
-            <w:r>
-              <w:rPr>
-                <w:b/>
-                <w:color w:val="FFFFFF"/>
-                <w:sz w:val="18"/>
-              </w:rPr>
-              <w:t>Status</w:t>
-            </w:r>
-          </w:p>
-        </w:tc>
-      </w:tr>
-      <w:tr>
-        <w:tc>
-          <w:tcPr>
-            <w:tcW w:type="dxa" w:w="567"/>
-          </w:tcPr>
-          <w:p>
-            <w:r/>
-            <w:r>
-              <w:rPr>
-                <w:sz w:val="19"/>
-              </w:rPr>
-              <w:t>4.1</w:t>
-            </w:r>
-          </w:p>
-        </w:tc>
-        <w:tc>
-          <w:tcPr>
-            <w:tcW w:type="dxa" w:w="3969"/>
-          </w:tcPr>
-          <w:p>
-            <w:r/>
-            <w:r>
-              <w:rPr>
-                <w:sz w:val="19"/>
-              </w:rPr>
-              <w:t>Cleaners on hourly / daily / weekly / monthly basis</w:t>
-            </w:r>
-          </w:p>
-        </w:tc>
-        <w:tc>
-          <w:tcPr>
-            <w:tcW w:type="dxa" w:w="4082"/>
-            <w:shd w:val="clear" w:color="auto" w:fill="FFFBEA"/>
-          </w:tcPr>
-          <w:p>
-            <w:r/>
-            <w:r>
-              <w:rPr>
-                <w:sz w:val="19"/>
-              </w:rPr>
-              <w:t xml:space="preserve">Yes / No: </w:t>
-            </w:r>
-          </w:p>
-        </w:tc>
-        <w:tc>
-          <w:tcPr>
-            <w:tcW w:type="dxa" w:w="1247"/>
-          </w:tcPr>
-          <w:p>
-            <w:r/>
-            <w:r>
-              <w:rPr>
-                <w:b/>
-                <w:color w:val="B42318"/>
-                <w:sz w:val="18"/>
-              </w:rPr>
-              <w:t>Required</w:t>
-            </w:r>
-          </w:p>
-        </w:tc>
-      </w:tr>
-      <w:tr>
-        <w:tc>
-          <w:tcPr>
-            <w:tcW w:type="dxa" w:w="567"/>
-          </w:tcPr>
-          <w:p>
-            <w:r/>
-            <w:r>
-              <w:rPr>
-                <w:sz w:val="19"/>
-              </w:rPr>
-              <w:t>4.2</w:t>
-            </w:r>
-          </w:p>
-        </w:tc>
-        <w:tc>
-          <w:tcPr>
-            <w:tcW w:type="dxa" w:w="3969"/>
-          </w:tcPr>
-          <w:p>
-            <w:r/>
-            <w:r>
-              <w:rPr>
-                <w:sz w:val="19"/>
-              </w:rPr>
-              <w:t>Maintenance technicians on hourly / daily / monthly basis</w:t>
-            </w:r>
-            <w:r>
-              <w:rPr>
-                <w:i/>
-                <w:color w:val="5A6778"/>
-                <w:sz w:val="16"/>
-              </w:rPr>
-              <w:br/>
-              <w:t>which trades? electrician, plumber, AC, handyman, painter…</w:t>
-            </w:r>
-          </w:p>
-        </w:tc>
-        <w:tc>
-          <w:tcPr>
-            <w:tcW w:type="dxa" w:w="4082"/>
-            <w:shd w:val="clear" w:color="auto" w:fill="FFFBEA"/>
-          </w:tcPr>
-          <w:p>
-            <w:r/>
-            <w:r>
-              <w:rPr>
-                <w:sz w:val="19"/>
-              </w:rPr>
-            </w:r>
-          </w:p>
-        </w:tc>
-        <w:tc>
-          <w:tcPr>
-            <w:tcW w:type="dxa" w:w="1247"/>
-          </w:tcPr>
-          <w:p>
-            <w:r/>
-            <w:r>
-              <w:rPr>
-                <w:b/>
-                <w:color w:val="B42318"/>
-                <w:sz w:val="18"/>
-              </w:rPr>
-              <w:t>Required</w:t>
-            </w:r>
-          </w:p>
-        </w:tc>
-      </w:tr>
-      <w:tr>
-        <w:tc>
-          <w:tcPr>
-            <w:tcW w:type="dxa" w:w="567"/>
-          </w:tcPr>
-          <w:p>
-            <w:r/>
-            <w:r>
-              <w:rPr>
-                <w:sz w:val="19"/>
-              </w:rPr>
-              <w:t>4.3</w:t>
-            </w:r>
-          </w:p>
-        </w:tc>
-        <w:tc>
-          <w:tcPr>
-            <w:tcW w:type="dxa" w:w="3969"/>
-          </w:tcPr>
-          <w:p>
-            <w:r/>
-            <w:r>
-              <w:rPr>
-                <w:sz w:val="19"/>
-              </w:rPr>
-              <w:t>Building maintenance jobs (electrical, plumbing, civil, painting, carpentry)</w:t>
-            </w:r>
-          </w:p>
-        </w:tc>
-        <w:tc>
-          <w:tcPr>
-            <w:tcW w:type="dxa" w:w="4082"/>
-            <w:shd w:val="clear" w:color="auto" w:fill="FFFBEA"/>
-          </w:tcPr>
-          <w:p>
-            <w:r/>
-            <w:r>
-              <w:rPr>
-                <w:sz w:val="19"/>
-              </w:rPr>
-              <w:t xml:space="preserve">Yes / No: </w:t>
-            </w:r>
-          </w:p>
-        </w:tc>
-        <w:tc>
-          <w:tcPr>
-            <w:tcW w:type="dxa" w:w="1247"/>
-          </w:tcPr>
-          <w:p>
-            <w:r/>
-            <w:r>
-              <w:rPr>
-                <w:b/>
-                <w:color w:val="B42318"/>
-                <w:sz w:val="18"/>
-              </w:rPr>
-              <w:t>Required</w:t>
-            </w:r>
-          </w:p>
-        </w:tc>
-      </w:tr>
-      <w:tr>
-        <w:tc>
-          <w:tcPr>
-            <w:tcW w:type="dxa" w:w="567"/>
-          </w:tcPr>
-          <w:p>
-            <w:r/>
-            <w:r>
-              <w:rPr>
-                <w:sz w:val="19"/>
-              </w:rPr>
-              <w:t>4.4</w:t>
-            </w:r>
-          </w:p>
-        </w:tc>
-        <w:tc>
-          <w:tcPr>
-            <w:tcW w:type="dxa" w:w="3969"/>
-          </w:tcPr>
-          <w:p>
-            <w:r/>
-            <w:r>
-              <w:rPr>
-                <w:sz w:val="19"/>
-              </w:rPr>
-              <w:t>Annual maintenance contracts (AMC) for buildings / villas</w:t>
-            </w:r>
-          </w:p>
-        </w:tc>
-        <w:tc>
-          <w:tcPr>
-            <w:tcW w:type="dxa" w:w="4082"/>
-            <w:shd w:val="clear" w:color="auto" w:fill="FFFBEA"/>
-          </w:tcPr>
-          <w:p>
-            <w:r/>
-            <w:r>
-              <w:rPr>
-                <w:sz w:val="19"/>
-              </w:rPr>
-              <w:t xml:space="preserve">Yes / No: </w:t>
-            </w:r>
-          </w:p>
-        </w:tc>
-        <w:tc>
-          <w:tcPr>
-            <w:tcW w:type="dxa" w:w="1247"/>
-          </w:tcPr>
-          <w:p>
-            <w:r/>
-            <w:r>
-              <w:rPr>
-                <w:b/>
-                <w:color w:val="B42318"/>
-                <w:sz w:val="18"/>
-              </w:rPr>
-              <w:t>Required</w:t>
-            </w:r>
-          </w:p>
-        </w:tc>
-      </w:tr>
-      <w:tr>
-        <w:tc>
-          <w:tcPr>
-            <w:tcW w:type="dxa" w:w="567"/>
-          </w:tcPr>
-          <w:p>
-            <w:r/>
-            <w:r>
-              <w:rPr>
-                <w:sz w:val="19"/>
-              </w:rPr>
-              <w:t>4.5</w:t>
-            </w:r>
-          </w:p>
-        </w:tc>
-        <w:tc>
-          <w:tcPr>
-            <w:tcW w:type="dxa" w:w="3969"/>
-          </w:tcPr>
-          <w:p>
-            <w:r/>
-            <w:r>
-              <w:rPr>
-                <w:sz w:val="19"/>
-              </w:rPr>
-              <w:t>AC servicing and duct cleaning</w:t>
-            </w:r>
-          </w:p>
-        </w:tc>
-        <w:tc>
-          <w:tcPr>
-            <w:tcW w:type="dxa" w:w="4082"/>
-            <w:shd w:val="clear" w:color="auto" w:fill="FFFBEA"/>
-          </w:tcPr>
-          <w:p>
-            <w:r/>
-            <w:r>
-              <w:rPr>
-                <w:sz w:val="19"/>
-              </w:rPr>
-              <w:t xml:space="preserve">Yes / No: </w:t>
-            </w:r>
-          </w:p>
-        </w:tc>
-        <w:tc>
-          <w:tcPr>
-            <w:tcW w:type="dxa" w:w="1247"/>
-          </w:tcPr>
-          <w:p>
-            <w:r/>
-            <w:r>
-              <w:rPr>
-                <w:b/>
-                <w:color w:val="B42318"/>
-                <w:sz w:val="18"/>
-              </w:rPr>
-              <w:t>Required</w:t>
-            </w:r>
-          </w:p>
-        </w:tc>
-      </w:tr>
-      <w:tr>
-        <w:tc>
-          <w:tcPr>
-            <w:tcW w:type="dxa" w:w="567"/>
-          </w:tcPr>
-          <w:p>
-            <w:r/>
-            <w:r>
-              <w:rPr>
-                <w:sz w:val="19"/>
-              </w:rPr>
-              <w:t>4.6</w:t>
-            </w:r>
-          </w:p>
-        </w:tc>
-        <w:tc>
-          <w:tcPr>
-            <w:tcW w:type="dxa" w:w="3969"/>
-          </w:tcPr>
-          <w:p>
-            <w:r/>
-            <w:r>
-              <w:rPr>
-                <w:sz w:val="19"/>
-              </w:rPr>
-              <w:t>Deep cleaning, move-in/move-out, post-construction, sofa/carpet cleaning</w:t>
-            </w:r>
-          </w:p>
-        </w:tc>
-        <w:tc>
-          <w:tcPr>
-            <w:tcW w:type="dxa" w:w="4082"/>
-            <w:shd w:val="clear" w:color="auto" w:fill="FFFBEA"/>
-          </w:tcPr>
-          <w:p>
-            <w:r/>
-            <w:r>
-              <w:rPr>
-                <w:sz w:val="19"/>
-              </w:rPr>
-              <w:t xml:space="preserve">Yes / No: </w:t>
-            </w:r>
-          </w:p>
-        </w:tc>
-        <w:tc>
-          <w:tcPr>
-            <w:tcW w:type="dxa" w:w="1247"/>
-          </w:tcPr>
-          <w:p>
-            <w:r/>
-            <w:r>
-              <w:rPr>
-                <w:b/>
-                <w:color w:val="B42318"/>
-                <w:sz w:val="18"/>
-              </w:rPr>
-              <w:t>Required</w:t>
-            </w:r>
-          </w:p>
-        </w:tc>
-      </w:tr>
-      <w:tr>
-        <w:tc>
-          <w:tcPr>
-            <w:tcW w:type="dxa" w:w="567"/>
-          </w:tcPr>
-          <w:p>
-            <w:r/>
-            <w:r>
-              <w:rPr>
-                <w:sz w:val="19"/>
-              </w:rPr>
-              <w:t>4.7</w:t>
-            </w:r>
-          </w:p>
-        </w:tc>
-        <w:tc>
-          <w:tcPr>
-            <w:tcW w:type="dxa" w:w="3969"/>
-          </w:tcPr>
-          <w:p>
-            <w:r/>
-            <w:r>
-              <w:rPr>
-                <w:sz w:val="19"/>
-              </w:rPr>
-              <w:t>Facade / window cleaning at height · Water tank cleaning · Pest control</w:t>
-            </w:r>
-          </w:p>
-        </w:tc>
-        <w:tc>
-          <w:tcPr>
-            <w:tcW w:type="dxa" w:w="4082"/>
-            <w:shd w:val="clear" w:color="auto" w:fill="FFFBEA"/>
-          </w:tcPr>
-          <w:p>
-            <w:r/>
-            <w:r>
-              <w:rPr>
-                <w:sz w:val="19"/>
-              </w:rPr>
-              <w:t xml:space="preserve">Which ones: </w:t>
-            </w:r>
-          </w:p>
-        </w:tc>
-        <w:tc>
-          <w:tcPr>
-            <w:tcW w:type="dxa" w:w="1247"/>
-          </w:tcPr>
-          <w:p>
-            <w:r/>
-            <w:r>
-              <w:rPr>
-                <w:b/>
-                <w:color w:val="B42318"/>
-                <w:sz w:val="18"/>
-              </w:rPr>
-              <w:t>Required</w:t>
-            </w:r>
-          </w:p>
-        </w:tc>
-      </w:tr>
-      <w:tr>
-        <w:tc>
-          <w:tcPr>
-            <w:tcW w:type="dxa" w:w="567"/>
-          </w:tcPr>
-          <w:p>
-            <w:r/>
-            <w:r>
-              <w:rPr>
-                <w:sz w:val="19"/>
-              </w:rPr>
-              <w:t>4.8</w:t>
-            </w:r>
-          </w:p>
-        </w:tc>
-        <w:tc>
-          <w:tcPr>
-            <w:tcW w:type="dxa" w:w="3969"/>
-          </w:tcPr>
-          <w:p>
-            <w:r/>
-            <w:r>
-              <w:rPr>
-                <w:sz w:val="19"/>
-              </w:rPr>
-              <w:t>Any other services?</w:t>
-            </w:r>
-            <w:r>
-              <w:rPr>
-                <w:i/>
-                <w:color w:val="5A6778"/>
-                <w:sz w:val="16"/>
-              </w:rPr>
-              <w:br/>
-              <w:t>e.g. housemaids, office boys, security guards, landscaping, pool cleaning, manpower supply</w:t>
-            </w:r>
-          </w:p>
-        </w:tc>
-        <w:tc>
-          <w:tcPr>
-            <w:tcW w:type="dxa" w:w="4082"/>
-            <w:shd w:val="clear" w:color="auto" w:fill="FFFBEA"/>
-          </w:tcPr>
-          <w:p>
-            <w:r/>
-            <w:r>
-              <w:rPr>
-                <w:sz w:val="19"/>
-              </w:rPr>
-            </w:r>
-          </w:p>
-        </w:tc>
-        <w:tc>
-          <w:tcPr>
-            <w:tcW w:type="dxa" w:w="1247"/>
-          </w:tcPr>
-          <w:p>
-            <w:r/>
-            <w:r>
-              <w:rPr>
-                <w:b/>
-                <w:color w:val="0F7C74"/>
-                <w:sz w:val="18"/>
-              </w:rPr>
-              <w:t>Optional</w:t>
-            </w:r>
-          </w:p>
-        </w:tc>
-      </w:tr>
-      <w:tr>
-        <w:tc>
-          <w:tcPr>
-            <w:tcW w:type="dxa" w:w="567"/>
-          </w:tcPr>
-          <w:p>
-            <w:r/>
-            <w:r>
-              <w:rPr>
-                <w:sz w:val="19"/>
-              </w:rPr>
-              <w:t>4.9</w:t>
-            </w:r>
-          </w:p>
-        </w:tc>
-        <w:tc>
-          <w:tcPr>
-            <w:tcW w:type="dxa" w:w="3969"/>
-          </w:tcPr>
-          <w:p>
-            <w:r/>
-            <w:r>
-              <w:rPr>
-                <w:sz w:val="19"/>
-              </w:rPr>
-              <w:t>Types of customers</w:t>
-            </w:r>
-            <w:r>
-              <w:rPr>
-                <w:i/>
-                <w:color w:val="5A6778"/>
-                <w:sz w:val="16"/>
-              </w:rPr>
-              <w:br/>
-              <w:t>homes/villas, offices, shops, towers, schools, hotels, clinics, warehouses</w:t>
-            </w:r>
-          </w:p>
-        </w:tc>
-        <w:tc>
-          <w:tcPr>
-            <w:tcW w:type="dxa" w:w="4082"/>
-            <w:shd w:val="clear" w:color="auto" w:fill="FFFBEA"/>
-          </w:tcPr>
-          <w:p>
-            <w:r/>
-            <w:r>
-              <w:rPr>
-                <w:sz w:val="19"/>
-              </w:rPr>
-            </w:r>
-          </w:p>
-        </w:tc>
-        <w:tc>
-          <w:tcPr>
-            <w:tcW w:type="dxa" w:w="1247"/>
-          </w:tcPr>
-          <w:p>
-            <w:r/>
-            <w:r>
-              <w:rPr>
-                <w:b/>
-                <w:color w:val="B42318"/>
-                <w:sz w:val="18"/>
-              </w:rPr>
-              <w:t>Required</w:t>
-            </w:r>
-          </w:p>
-        </w:tc>
-      </w:tr>
-    </w:tbl>
-    <w:p>
-      <w:pPr>
-        <w:spacing w:after="40"/>
-      </w:pPr>
-    </w:p>
-    <w:p>
-      <w:pPr>
-        <w:spacing w:before="280" w:after="80"/>
-        <w:pBdr>
-          <w:bottom w:val="single" w:sz="12" w:space="1" w:color="C9A227"/>
-        </w:pBdr>
-      </w:pPr>
-      <w:r>
-        <w:rPr>
-          <w:b/>
-          <w:color w:val="0B2545"/>
-          <w:sz w:val="26"/>
-        </w:rPr>
-        <w:t>5. Prices &amp; booking rules</w:t>
+        <w:t>4. Prices &amp; booking rules</w:t>
       </w:r>
     </w:p>
     <w:p>
@@ -3087,7 +2932,7 @@
               <w:rPr>
                 <w:sz w:val="19"/>
               </w:rPr>
-              <w:t>5.1</w:t>
+              <w:t>4.1</w:t>
             </w:r>
           </w:p>
         </w:tc>
@@ -3156,7 +3001,7 @@
               <w:rPr>
                 <w:sz w:val="19"/>
               </w:rPr>
-              <w:t>5.2</w:t>
+              <w:t>4.2</w:t>
             </w:r>
           </w:p>
         </w:tc>
@@ -3216,7 +3061,7 @@
               <w:rPr>
                 <w:sz w:val="19"/>
               </w:rPr>
-              <w:t>5.3</w:t>
+              <w:t>4.3</w:t>
             </w:r>
           </w:p>
         </w:tc>
@@ -3276,7 +3121,7 @@
               <w:rPr>
                 <w:sz w:val="19"/>
               </w:rPr>
-              <w:t>5.4</w:t>
+              <w:t>4.4</w:t>
             </w:r>
           </w:p>
         </w:tc>
@@ -3336,7 +3181,7 @@
               <w:rPr>
                 <w:sz w:val="19"/>
               </w:rPr>
-              <w:t>5.5</w:t>
+              <w:t>4.5</w:t>
             </w:r>
           </w:p>
         </w:tc>
@@ -3350,7 +3195,7 @@
               <w:rPr>
                 <w:sz w:val="19"/>
               </w:rPr>
-              <w:t>Rates for technicians (per visit / per hour / per month)</w:t>
+              <w:t>Rates for technicians (per visit / hour / month)</w:t>
             </w:r>
           </w:p>
         </w:tc>
@@ -3396,7 +3241,7 @@
               <w:rPr>
                 <w:sz w:val="19"/>
               </w:rPr>
-              <w:t>5.6</w:t>
+              <w:t>4.6</w:t>
             </w:r>
           </w:p>
         </w:tc>
@@ -3410,7 +3255,7 @@
               <w:rPr>
                 <w:sz w:val="19"/>
               </w:rPr>
-              <w:t>Extra charges for other emirates / transport charges?</w:t>
+              <w:t>Extra charges for other emirates / transport</w:t>
             </w:r>
           </w:p>
         </w:tc>
@@ -3456,7 +3301,7 @@
               <w:rPr>
                 <w:sz w:val="19"/>
               </w:rPr>
-              <w:t>5.7</w:t>
+              <w:t>4.7</w:t>
             </w:r>
           </w:p>
         </w:tc>
@@ -3470,7 +3315,7 @@
               <w:rPr>
                 <w:sz w:val="19"/>
               </w:rPr>
-              <w:t>Payment methods (cash, card, bank transfer, payment link); prices incl. or excl. VAT?</w:t>
+              <w:t>Payment methods; prices incl. or excl. VAT</w:t>
             </w:r>
           </w:p>
         </w:tc>
@@ -3516,7 +3361,7 @@
               <w:rPr>
                 <w:sz w:val="19"/>
               </w:rPr>
-              <w:t>5.8</w:t>
+              <w:t>4.8</w:t>
             </w:r>
           </w:p>
         </w:tc>
@@ -3576,7 +3421,7 @@
               <w:rPr>
                 <w:sz w:val="19"/>
               </w:rPr>
-              <w:t>5.9</w:t>
+              <w:t>4.9</w:t>
             </w:r>
           </w:p>
         </w:tc>
@@ -3599,7 +3444,7 @@
                 <w:sz w:val="16"/>
               </w:rPr>
               <w:br/>
-              <w:t>e.g. emergency 2 hours, normal 24–48 hours</w:t>
+              <w:t>the website currently says: emergency 2 hours, urgent same day, routine 48 hours</w:t>
             </w:r>
           </w:p>
         </w:tc>
@@ -3614,6 +3459,7 @@
               <w:rPr>
                 <w:sz w:val="19"/>
               </w:rPr>
+              <w:t xml:space="preserve">Keep / Change to: </w:t>
             </w:r>
           </w:p>
         </w:tc>
@@ -3626,10 +3472,10 @@
             <w:r>
               <w:rPr>
                 <w:b/>
-                <w:color w:val="0F7C74"/>
+                <w:color w:val="B42318"/>
                 <w:sz w:val="18"/>
               </w:rPr>
-              <w:t>Optional</w:t>
+              <w:t>Required</w:t>
             </w:r>
           </w:p>
         </w:tc>
@@ -3653,7 +3499,7 @@
           <w:color w:val="0B2545"/>
           <w:sz w:val="26"/>
         </w:rPr>
-        <w:t>6. Company in numbers</w:t>
+        <w:t>5. Team &amp; experience</w:t>
       </w:r>
     </w:p>
     <w:p>
@@ -3667,7 +3513,7 @@
           <w:color w:val="5A6778"/>
           <w:sz w:val="18"/>
         </w:rPr>
-        <w:t>Real numbers only. Leave blank anything you prefer not to publish.</w:t>
+        <w:t>The company is new, but the owner’s and team’s previous experience can be shown honestly, e.g. “10 years in UAE facilities work”.</w:t>
       </w:r>
     </w:p>
     <w:tbl>
@@ -3764,7 +3610,7 @@
               <w:rPr>
                 <w:sz w:val="19"/>
               </w:rPr>
-              <w:t>6.1</w:t>
+              <w:t>5.1</w:t>
             </w:r>
           </w:p>
         </w:tc>
@@ -3778,7 +3624,7 @@
               <w:rPr>
                 <w:sz w:val="19"/>
               </w:rPr>
-              <w:t>Total staff (cleaners / technicians / office)</w:t>
+              <w:t>Owner’s background: previous experience in cleaning / maintenance (years, companies or types of work)</w:t>
             </w:r>
           </w:p>
         </w:tc>
@@ -3824,7 +3670,7 @@
               <w:rPr>
                 <w:sz w:val="19"/>
               </w:rPr>
-              <w:t>6.2</w:t>
+              <w:t>5.2</w:t>
             </w:r>
           </w:p>
         </w:tc>
@@ -3838,7 +3684,7 @@
               <w:rPr>
                 <w:sz w:val="19"/>
               </w:rPr>
-              <w:t>Number of regular clients or active contracts</w:t>
+              <w:t>Professional photo of the owner (or “Do not show photo”)</w:t>
             </w:r>
           </w:p>
         </w:tc>
@@ -3884,7 +3730,7 @@
               <w:rPr>
                 <w:sz w:val="19"/>
               </w:rPr>
-              <w:t>6.3</w:t>
+              <w:t>5.3</w:t>
             </w:r>
           </w:p>
         </w:tc>
@@ -3898,7 +3744,7 @@
               <w:rPr>
                 <w:sz w:val="19"/>
               </w:rPr>
-              <w:t>Number of company vehicles</w:t>
+              <w:t>Other key people (supervisor, operations, accounts): name, role, short background</w:t>
             </w:r>
           </w:p>
         </w:tc>
@@ -3944,7 +3790,7 @@
               <w:rPr>
                 <w:sz w:val="19"/>
               </w:rPr>
-              <w:t>6.4</w:t>
+              <w:t>5.4</w:t>
             </w:r>
           </w:p>
         </w:tc>
@@ -3958,16 +3804,67 @@
               <w:rPr>
                 <w:sz w:val="19"/>
               </w:rPr>
-              <w:t>Important milestones by year</w:t>
-            </w:r>
-            <w:r>
-              <w:rPr>
-                <w:i/>
-                <w:color w:val="5A6778"/>
-                <w:sz w:val="16"/>
-              </w:rPr>
-              <w:br/>
-              <w:t>founded, first big contract, new emirate, staff growth…</w:t>
+              <w:t>Current number of staff (cleaners / technicians / office), or planned team size</w:t>
+            </w:r>
+          </w:p>
+        </w:tc>
+        <w:tc>
+          <w:tcPr>
+            <w:tcW w:type="dxa" w:w="4082"/>
+            <w:shd w:val="clear" w:color="auto" w:fill="FFFBEA"/>
+          </w:tcPr>
+          <w:p>
+            <w:r/>
+            <w:r>
+              <w:rPr>
+                <w:sz w:val="19"/>
+              </w:rPr>
+            </w:r>
+          </w:p>
+        </w:tc>
+        <w:tc>
+          <w:tcPr>
+            <w:tcW w:type="dxa" w:w="1247"/>
+          </w:tcPr>
+          <w:p>
+            <w:r/>
+            <w:r>
+              <w:rPr>
+                <w:b/>
+                <w:color w:val="0F7C74"/>
+                <w:sz w:val="18"/>
+              </w:rPr>
+              <w:t>Optional</w:t>
+            </w:r>
+          </w:p>
+        </w:tc>
+      </w:tr>
+      <w:tr>
+        <w:tc>
+          <w:tcPr>
+            <w:tcW w:type="dxa" w:w="567"/>
+          </w:tcPr>
+          <w:p>
+            <w:r/>
+            <w:r>
+              <w:rPr>
+                <w:sz w:val="19"/>
+              </w:rPr>
+              <w:t>5.5</w:t>
+            </w:r>
+          </w:p>
+        </w:tc>
+        <w:tc>
+          <w:tcPr>
+            <w:tcW w:type="dxa" w:w="3969"/>
+          </w:tcPr>
+          <w:p>
+            <w:r/>
+            <w:r>
+              <w:rPr>
+                <w:sz w:val="19"/>
+              </w:rPr>
+              <w:t>Number of company vehicles</w:t>
             </w:r>
           </w:p>
         </w:tc>
@@ -4021,7 +3918,7 @@
           <w:color w:val="0B2545"/>
           <w:sz w:val="26"/>
         </w:rPr>
-        <w:t>7. Owner &amp; management</w:t>
+        <w:t>6. Work &amp; reviews</w:t>
       </w:r>
     </w:p>
     <w:tbl>
@@ -4118,7 +4015,7 @@
               <w:rPr>
                 <w:sz w:val="19"/>
               </w:rPr>
-              <w:t>7.1</w:t>
+              <w:t>6.1</w:t>
             </w:r>
           </w:p>
         </w:tc>
@@ -4132,67 +4029,16 @@
               <w:rPr>
                 <w:sz w:val="19"/>
               </w:rPr>
-              <w:t>Owner / Managing Director: name, title, 2–3 lines of background</w:t>
-            </w:r>
-          </w:p>
-        </w:tc>
-        <w:tc>
-          <w:tcPr>
-            <w:tcW w:type="dxa" w:w="4082"/>
-            <w:shd w:val="clear" w:color="auto" w:fill="FFFBEA"/>
-          </w:tcPr>
-          <w:p>
-            <w:r/>
-            <w:r>
-              <w:rPr>
-                <w:sz w:val="19"/>
-              </w:rPr>
-            </w:r>
-          </w:p>
-        </w:tc>
-        <w:tc>
-          <w:tcPr>
-            <w:tcW w:type="dxa" w:w="1247"/>
-          </w:tcPr>
-          <w:p>
-            <w:r/>
-            <w:r>
-              <w:rPr>
-                <w:b/>
-                <w:color w:val="B42318"/>
-                <w:sz w:val="18"/>
-              </w:rPr>
-              <w:t>Required</w:t>
-            </w:r>
-          </w:p>
-        </w:tc>
-      </w:tr>
-      <w:tr>
-        <w:tc>
-          <w:tcPr>
-            <w:tcW w:type="dxa" w:w="567"/>
-          </w:tcPr>
-          <w:p>
-            <w:r/>
-            <w:r>
-              <w:rPr>
-                <w:sz w:val="19"/>
-              </w:rPr>
-              <w:t>7.2</w:t>
-            </w:r>
-          </w:p>
-        </w:tc>
-        <w:tc>
-          <w:tcPr>
-            <w:tcW w:type="dxa" w:w="3969"/>
-          </w:tcPr>
-          <w:p>
-            <w:r/>
-            <w:r>
-              <w:rPr>
-                <w:sz w:val="19"/>
-              </w:rPr>
-              <w:t>Other managers (operations, safety, finance, sales): name, title, short background</w:t>
+              <w:t>Jobs completed since August 2026, or the team’s earlier work</w:t>
+            </w:r>
+            <w:r>
+              <w:rPr>
+                <w:i/>
+                <w:color w:val="5A6778"/>
+                <w:sz w:val="16"/>
+              </w:rPr>
+              <w:br/>
+              <w:t>property type, emirate, work done</w:t>
             </w:r>
           </w:p>
         </w:tc>
@@ -4238,7 +4084,7 @@
               <w:rPr>
                 <w:sz w:val="19"/>
               </w:rPr>
-              <w:t>7.3</w:t>
+              <w:t>6.2</w:t>
             </w:r>
           </w:p>
         </w:tc>
@@ -4252,7 +4098,7 @@
               <w:rPr>
                 <w:sz w:val="19"/>
               </w:rPr>
-              <w:t>Professional photos of owner / managers (or “Do not show photos”)</w:t>
+              <w:t>Client names or logos we may show (or “Keep anonymous”)</w:t>
             </w:r>
           </w:p>
         </w:tc>
@@ -4298,7 +4144,7 @@
               <w:rPr>
                 <w:sz w:val="19"/>
               </w:rPr>
-              <w:t>7.4</w:t>
+              <w:t>6.3</w:t>
             </w:r>
           </w:p>
         </w:tc>
@@ -4312,7 +4158,7 @@
               <w:rPr>
                 <w:sz w:val="19"/>
               </w:rPr>
-              <w:t>Company vision / mission in your own words (we can write it if you prefer)</w:t>
+              <w:t>Genuine customer reviews with permission to publish, or your Google reviews link</w:t>
             </w:r>
           </w:p>
         </w:tc>
@@ -4366,7 +4212,7 @@
           <w:color w:val="0B2545"/>
           <w:sz w:val="26"/>
         </w:rPr>
-        <w:t>8. Clients, projects &amp; reviews</w:t>
+        <w:t>7. Logo &amp; photos</w:t>
       </w:r>
     </w:p>
     <w:tbl>
@@ -4463,7 +4309,7 @@
               <w:rPr>
                 <w:sz w:val="19"/>
               </w:rPr>
-              <w:t>8.1</w:t>
+              <w:t>7.1</w:t>
             </w:r>
           </w:p>
         </w:tc>
@@ -4477,7 +4323,7 @@
               <w:rPr>
                 <w:sz w:val="19"/>
               </w:rPr>
-              <w:t>4–8 past or current jobs</w:t>
+              <w:t>Logo file, best quality</w:t>
             </w:r>
             <w:r>
               <w:rPr>
@@ -4486,7 +4332,7 @@
                 <w:sz w:val="16"/>
               </w:rPr>
               <w:br/>
-              <w:t>type of property, emirate/area, work done, year</w:t>
+              <w:t>AI / SVG / PDF, or large PNG with transparent background. No logo? Write “Please design one”.</w:t>
             </w:r>
           </w:p>
         </w:tc>
@@ -4532,7 +4378,7 @@
               <w:rPr>
                 <w:sz w:val="19"/>
               </w:rPr>
-              <w:t>8.2</w:t>
+              <w:t>7.2</w:t>
             </w:r>
           </w:p>
         </w:tc>
@@ -4546,7 +4392,7 @@
               <w:rPr>
                 <w:sz w:val="19"/>
               </w:rPr>
-              <w:t>Client names or logos we are allowed to show (or “Keep anonymous”)</w:t>
+              <w:t>Brand colours (if any)</w:t>
             </w:r>
           </w:p>
         </w:tc>
@@ -4592,7 +4438,7 @@
               <w:rPr>
                 <w:sz w:val="19"/>
               </w:rPr>
-              <w:t>8.3</w:t>
+              <w:t>7.3</w:t>
             </w:r>
           </w:p>
         </w:tc>
@@ -4606,67 +4452,16 @@
               <w:rPr>
                 <w:sz w:val="19"/>
               </w:rPr>
-              <w:t>2–4 genuine customer reviews, with name/role and permission to publish</w:t>
-            </w:r>
-          </w:p>
-        </w:tc>
-        <w:tc>
-          <w:tcPr>
-            <w:tcW w:type="dxa" w:w="4082"/>
-            <w:shd w:val="clear" w:color="auto" w:fill="FFFBEA"/>
-          </w:tcPr>
-          <w:p>
-            <w:r/>
-            <w:r>
-              <w:rPr>
-                <w:sz w:val="19"/>
-              </w:rPr>
-            </w:r>
-          </w:p>
-        </w:tc>
-        <w:tc>
-          <w:tcPr>
-            <w:tcW w:type="dxa" w:w="1247"/>
-          </w:tcPr>
-          <w:p>
-            <w:r/>
-            <w:r>
-              <w:rPr>
-                <w:b/>
-                <w:color w:val="0F7C74"/>
-                <w:sz w:val="18"/>
-              </w:rPr>
-              <w:t>Optional</w:t>
-            </w:r>
-          </w:p>
-        </w:tc>
-      </w:tr>
-      <w:tr>
-        <w:tc>
-          <w:tcPr>
-            <w:tcW w:type="dxa" w:w="567"/>
-          </w:tcPr>
-          <w:p>
-            <w:r/>
-            <w:r>
-              <w:rPr>
-                <w:sz w:val="19"/>
-              </w:rPr>
-              <w:t>8.4</w:t>
-            </w:r>
-          </w:p>
-        </w:tc>
-        <w:tc>
-          <w:tcPr>
-            <w:tcW w:type="dxa" w:w="3969"/>
-          </w:tcPr>
-          <w:p>
-            <w:r/>
-            <w:r>
-              <w:rPr>
-                <w:sz w:val="19"/>
-              </w:rPr>
-              <w:t>Google reviews link, if any</w:t>
+              <w:t>Real photos</w:t>
+            </w:r>
+            <w:r>
+              <w:rPr>
+                <w:i/>
+                <w:color w:val="5A6778"/>
+                <w:sz w:val="16"/>
+              </w:rPr>
+              <w:br/>
+              <w:t>team in uniform, vehicles, office, staff at work, before/after. These replace the current stock photos.</w:t>
             </w:r>
           </w:p>
         </w:tc>
@@ -4720,7 +4515,7 @@
           <w:color w:val="0B2545"/>
           <w:sz w:val="26"/>
         </w:rPr>
-        <w:t>9. Logo &amp; photos</w:t>
+        <w:t>8. Careers</w:t>
       </w:r>
     </w:p>
     <w:tbl>
@@ -4817,7 +4612,7 @@
               <w:rPr>
                 <w:sz w:val="19"/>
               </w:rPr>
-              <w:t>9.1</w:t>
+              <w:t>8.1</w:t>
             </w:r>
           </w:p>
         </w:tc>
@@ -4831,7 +4626,127 @@
               <w:rPr>
                 <w:sz w:val="19"/>
               </w:rPr>
-              <w:t>Logo file in best quality</w:t>
+              <w:t>Show a careers page? (Yes / No)</w:t>
+            </w:r>
+          </w:p>
+        </w:tc>
+        <w:tc>
+          <w:tcPr>
+            <w:tcW w:type="dxa" w:w="4082"/>
+            <w:shd w:val="clear" w:color="auto" w:fill="FFFBEA"/>
+          </w:tcPr>
+          <w:p>
+            <w:r/>
+            <w:r>
+              <w:rPr>
+                <w:sz w:val="19"/>
+              </w:rPr>
+            </w:r>
+          </w:p>
+        </w:tc>
+        <w:tc>
+          <w:tcPr>
+            <w:tcW w:type="dxa" w:w="1247"/>
+          </w:tcPr>
+          <w:p>
+            <w:r/>
+            <w:r>
+              <w:rPr>
+                <w:b/>
+                <w:color w:val="B42318"/>
+                <w:sz w:val="18"/>
+              </w:rPr>
+              <w:t>Required</w:t>
+            </w:r>
+          </w:p>
+        </w:tc>
+      </w:tr>
+      <w:tr>
+        <w:tc>
+          <w:tcPr>
+            <w:tcW w:type="dxa" w:w="567"/>
+          </w:tcPr>
+          <w:p>
+            <w:r/>
+            <w:r>
+              <w:rPr>
+                <w:sz w:val="19"/>
+              </w:rPr>
+              <w:t>8.2</w:t>
+            </w:r>
+          </w:p>
+        </w:tc>
+        <w:tc>
+          <w:tcPr>
+            <w:tcW w:type="dxa" w:w="3969"/>
+          </w:tcPr>
+          <w:p>
+            <w:r/>
+            <w:r>
+              <w:rPr>
+                <w:sz w:val="19"/>
+              </w:rPr>
+              <w:t>Current job openings: title, emirate, requirements</w:t>
+            </w:r>
+          </w:p>
+        </w:tc>
+        <w:tc>
+          <w:tcPr>
+            <w:tcW w:type="dxa" w:w="4082"/>
+            <w:shd w:val="clear" w:color="auto" w:fill="FFFBEA"/>
+          </w:tcPr>
+          <w:p>
+            <w:r/>
+            <w:r>
+              <w:rPr>
+                <w:sz w:val="19"/>
+              </w:rPr>
+            </w:r>
+          </w:p>
+        </w:tc>
+        <w:tc>
+          <w:tcPr>
+            <w:tcW w:type="dxa" w:w="1247"/>
+          </w:tcPr>
+          <w:p>
+            <w:r/>
+            <w:r>
+              <w:rPr>
+                <w:b/>
+                <w:color w:val="0F7C74"/>
+                <w:sz w:val="18"/>
+              </w:rPr>
+              <w:t>Optional</w:t>
+            </w:r>
+          </w:p>
+        </w:tc>
+      </w:tr>
+      <w:tr>
+        <w:tc>
+          <w:tcPr>
+            <w:tcW w:type="dxa" w:w="567"/>
+          </w:tcPr>
+          <w:p>
+            <w:r/>
+            <w:r>
+              <w:rPr>
+                <w:sz w:val="19"/>
+              </w:rPr>
+              <w:t>8.3</w:t>
+            </w:r>
+          </w:p>
+        </w:tc>
+        <w:tc>
+          <w:tcPr>
+            <w:tcW w:type="dxa" w:w="3969"/>
+          </w:tcPr>
+          <w:p>
+            <w:r/>
+            <w:r>
+              <w:rPr>
+                <w:sz w:val="19"/>
+              </w:rPr>
+              <w:t>Staff benefits</w:t>
             </w:r>
             <w:r>
               <w:rPr>
@@ -4840,196 +4755,7 @@
                 <w:sz w:val="16"/>
               </w:rPr>
               <w:br/>
-              <w:t>AI / SVG / PDF, or large PNG with transparent background. No logo? Write “Please design one”.</w:t>
-            </w:r>
-          </w:p>
-        </w:tc>
-        <w:tc>
-          <w:tcPr>
-            <w:tcW w:type="dxa" w:w="4082"/>
-            <w:shd w:val="clear" w:color="auto" w:fill="FFFBEA"/>
-          </w:tcPr>
-          <w:p>
-            <w:r/>
-            <w:r>
-              <w:rPr>
-                <w:sz w:val="19"/>
-              </w:rPr>
-            </w:r>
-          </w:p>
-        </w:tc>
-        <w:tc>
-          <w:tcPr>
-            <w:tcW w:type="dxa" w:w="1247"/>
-          </w:tcPr>
-          <w:p>
-            <w:r/>
-            <w:r>
-              <w:rPr>
-                <w:b/>
-                <w:color w:val="B42318"/>
-                <w:sz w:val="18"/>
-              </w:rPr>
-              <w:t>Required</w:t>
-            </w:r>
-          </w:p>
-        </w:tc>
-      </w:tr>
-      <w:tr>
-        <w:tc>
-          <w:tcPr>
-            <w:tcW w:type="dxa" w:w="567"/>
-          </w:tcPr>
-          <w:p>
-            <w:r/>
-            <w:r>
-              <w:rPr>
-                <w:sz w:val="19"/>
-              </w:rPr>
-              <w:t>9.2</w:t>
-            </w:r>
-          </w:p>
-        </w:tc>
-        <w:tc>
-          <w:tcPr>
-            <w:tcW w:type="dxa" w:w="3969"/>
-          </w:tcPr>
-          <w:p>
-            <w:r/>
-            <w:r>
-              <w:rPr>
-                <w:sz w:val="19"/>
-              </w:rPr>
-              <w:t>Brand colours (if any)</w:t>
-            </w:r>
-          </w:p>
-        </w:tc>
-        <w:tc>
-          <w:tcPr>
-            <w:tcW w:type="dxa" w:w="4082"/>
-            <w:shd w:val="clear" w:color="auto" w:fill="FFFBEA"/>
-          </w:tcPr>
-          <w:p>
-            <w:r/>
-            <w:r>
-              <w:rPr>
-                <w:sz w:val="19"/>
-              </w:rPr>
-            </w:r>
-          </w:p>
-        </w:tc>
-        <w:tc>
-          <w:tcPr>
-            <w:tcW w:type="dxa" w:w="1247"/>
-          </w:tcPr>
-          <w:p>
-            <w:r/>
-            <w:r>
-              <w:rPr>
-                <w:b/>
-                <w:color w:val="0F7C74"/>
-                <w:sz w:val="18"/>
-              </w:rPr>
-              <w:t>Optional</w:t>
-            </w:r>
-          </w:p>
-        </w:tc>
-      </w:tr>
-      <w:tr>
-        <w:tc>
-          <w:tcPr>
-            <w:tcW w:type="dxa" w:w="567"/>
-          </w:tcPr>
-          <w:p>
-            <w:r/>
-            <w:r>
-              <w:rPr>
-                <w:sz w:val="19"/>
-              </w:rPr>
-              <w:t>9.3</w:t>
-            </w:r>
-          </w:p>
-        </w:tc>
-        <w:tc>
-          <w:tcPr>
-            <w:tcW w:type="dxa" w:w="3969"/>
-          </w:tcPr>
-          <w:p>
-            <w:r/>
-            <w:r>
-              <w:rPr>
-                <w:sz w:val="19"/>
-              </w:rPr>
-              <w:t>Real photos</w:t>
-            </w:r>
-            <w:r>
-              <w:rPr>
-                <w:i/>
-                <w:color w:val="5A6778"/>
-                <w:sz w:val="16"/>
-              </w:rPr>
-              <w:br/>
-              <w:t>team in uniform, vehicles, office, staff at work, before/after. These replace the current stock photos.</w:t>
-            </w:r>
-          </w:p>
-        </w:tc>
-        <w:tc>
-          <w:tcPr>
-            <w:tcW w:type="dxa" w:w="4082"/>
-            <w:shd w:val="clear" w:color="auto" w:fill="FFFBEA"/>
-          </w:tcPr>
-          <w:p>
-            <w:r/>
-            <w:r>
-              <w:rPr>
-                <w:sz w:val="19"/>
-              </w:rPr>
-            </w:r>
-          </w:p>
-        </w:tc>
-        <w:tc>
-          <w:tcPr>
-            <w:tcW w:type="dxa" w:w="1247"/>
-          </w:tcPr>
-          <w:p>
-            <w:r/>
-            <w:r>
-              <w:rPr>
-                <w:b/>
-                <w:color w:val="0F7C74"/>
-                <w:sz w:val="18"/>
-              </w:rPr>
-              <w:t>Optional</w:t>
-            </w:r>
-          </w:p>
-        </w:tc>
-      </w:tr>
-      <w:tr>
-        <w:tc>
-          <w:tcPr>
-            <w:tcW w:type="dxa" w:w="567"/>
-          </w:tcPr>
-          <w:p>
-            <w:r/>
-            <w:r>
-              <w:rPr>
-                <w:sz w:val="19"/>
-              </w:rPr>
-              <w:t>9.4</w:t>
-            </w:r>
-          </w:p>
-        </w:tc>
-        <w:tc>
-          <w:tcPr>
-            <w:tcW w:type="dxa" w:w="3969"/>
-          </w:tcPr>
-          <w:p>
-            <w:r/>
-            <w:r>
-              <w:rPr>
-                <w:sz w:val="19"/>
-              </w:rPr>
-              <w:t>Existing company profile / brochure (PDF)</w:t>
+              <w:t>visa, accommodation, transport, medical, leave / ticket</w:t>
             </w:r>
           </w:p>
         </w:tc>
@@ -5083,7 +4809,7 @@
           <w:color w:val="0B2545"/>
           <w:sz w:val="26"/>
         </w:rPr>
-        <w:t>10. Careers</w:t>
+        <w:t>9. Domain, email &amp; approval</w:t>
       </w:r>
     </w:p>
     <w:tbl>
@@ -5180,7 +4906,7 @@
               <w:rPr>
                 <w:sz w:val="19"/>
               </w:rPr>
-              <w:t>10.1</w:t>
+              <w:t>9.1</w:t>
             </w:r>
           </w:p>
         </w:tc>
@@ -5194,7 +4920,7 @@
               <w:rPr>
                 <w:sz w:val="19"/>
               </w:rPr>
-              <w:t>Show a careers page? (Yes / No)</w:t>
+              <w:t>Do you own babalhidaya.ae / babalhidaya.com? With which registrar?</w:t>
             </w:r>
           </w:p>
         </w:tc>
@@ -5240,7 +4966,7 @@
               <w:rPr>
                 <w:sz w:val="19"/>
               </w:rPr>
-              <w:t>10.2</w:t>
+              <w:t>9.2</w:t>
             </w:r>
           </w:p>
         </w:tc>
@@ -5254,7 +4980,76 @@
               <w:rPr>
                 <w:sz w:val="19"/>
               </w:rPr>
-              <w:t>Current job openings: title, emirate, requirements</w:t>
+              <w:t>If not, shall we buy it for you?</w:t>
+            </w:r>
+            <w:r>
+              <w:rPr>
+                <w:i/>
+                <w:color w:val="5A6778"/>
+                <w:sz w:val="16"/>
+              </w:rPr>
+              <w:br/>
+              <w:t>.ae requires a copy of the trade licence (already received)</w:t>
+            </w:r>
+          </w:p>
+        </w:tc>
+        <w:tc>
+          <w:tcPr>
+            <w:tcW w:type="dxa" w:w="4082"/>
+            <w:shd w:val="clear" w:color="auto" w:fill="FFFBEA"/>
+          </w:tcPr>
+          <w:p>
+            <w:r/>
+            <w:r>
+              <w:rPr>
+                <w:sz w:val="19"/>
+              </w:rPr>
+            </w:r>
+          </w:p>
+        </w:tc>
+        <w:tc>
+          <w:tcPr>
+            <w:tcW w:type="dxa" w:w="1247"/>
+          </w:tcPr>
+          <w:p>
+            <w:r/>
+            <w:r>
+              <w:rPr>
+                <w:b/>
+                <w:color w:val="B42318"/>
+                <w:sz w:val="18"/>
+              </w:rPr>
+              <w:t>Required</w:t>
+            </w:r>
+          </w:p>
+        </w:tc>
+      </w:tr>
+      <w:tr>
+        <w:tc>
+          <w:tcPr>
+            <w:tcW w:type="dxa" w:w="567"/>
+          </w:tcPr>
+          <w:p>
+            <w:r/>
+            <w:r>
+              <w:rPr>
+                <w:sz w:val="19"/>
+              </w:rPr>
+              <w:t>9.3</w:t>
+            </w:r>
+          </w:p>
+        </w:tc>
+        <w:tc>
+          <w:tcPr>
+            <w:tcW w:type="dxa" w:w="3969"/>
+          </w:tcPr>
+          <w:p>
+            <w:r/>
+            <w:r>
+              <w:rPr>
+                <w:sz w:val="19"/>
+              </w:rPr>
+              <w:t>Set up company email addresses (info@, sales@) on the domain?</w:t>
             </w:r>
           </w:p>
         </w:tc>
@@ -5300,7 +5095,7 @@
               <w:rPr>
                 <w:sz w:val="19"/>
               </w:rPr>
-              <w:t>10.3</w:t>
+              <w:t>9.4</w:t>
             </w:r>
           </w:p>
         </w:tc>
@@ -5314,16 +5109,67 @@
               <w:rPr>
                 <w:sz w:val="19"/>
               </w:rPr>
-              <w:t>Staff benefits</w:t>
-            </w:r>
-            <w:r>
-              <w:rPr>
-                <w:i/>
-                <w:color w:val="5A6778"/>
-                <w:sz w:val="16"/>
-              </w:rPr>
-              <w:br/>
-              <w:t>visa, accommodation, transport, medical, annual leave / ticket</w:t>
+              <w:t>Who approves the final website? (name + WhatsApp)</w:t>
+            </w:r>
+          </w:p>
+        </w:tc>
+        <w:tc>
+          <w:tcPr>
+            <w:tcW w:type="dxa" w:w="4082"/>
+            <w:shd w:val="clear" w:color="auto" w:fill="FFFBEA"/>
+          </w:tcPr>
+          <w:p>
+            <w:r/>
+            <w:r>
+              <w:rPr>
+                <w:sz w:val="19"/>
+              </w:rPr>
+            </w:r>
+          </w:p>
+        </w:tc>
+        <w:tc>
+          <w:tcPr>
+            <w:tcW w:type="dxa" w:w="1247"/>
+          </w:tcPr>
+          <w:p>
+            <w:r/>
+            <w:r>
+              <w:rPr>
+                <w:b/>
+                <w:color w:val="B42318"/>
+                <w:sz w:val="18"/>
+              </w:rPr>
+              <w:t>Required</w:t>
+            </w:r>
+          </w:p>
+        </w:tc>
+      </w:tr>
+      <w:tr>
+        <w:tc>
+          <w:tcPr>
+            <w:tcW w:type="dxa" w:w="567"/>
+          </w:tcPr>
+          <w:p>
+            <w:r/>
+            <w:r>
+              <w:rPr>
+                <w:sz w:val="19"/>
+              </w:rPr>
+              <w:t>9.5</w:t>
+            </w:r>
+          </w:p>
+        </w:tc>
+        <w:tc>
+          <w:tcPr>
+            <w:tcW w:type="dxa" w:w="3969"/>
+          </w:tcPr>
+          <w:p>
+            <w:r/>
+            <w:r>
+              <w:rPr>
+                <w:sz w:val="19"/>
+              </w:rPr>
+              <w:t>Who can check the Arabic text? (name + WhatsApp)</w:t>
             </w:r>
           </w:p>
         </w:tc>
@@ -5358,115 +5204,24 @@
           </w:p>
         </w:tc>
       </w:tr>
-    </w:tbl>
-    <w:p>
-      <w:pPr>
-        <w:spacing w:after="40"/>
-      </w:pPr>
-    </w:p>
-    <w:p>
-      <w:pPr>
-        <w:spacing w:before="280" w:after="80"/>
-        <w:pBdr>
-          <w:bottom w:val="single" w:sz="12" w:space="1" w:color="C9A227"/>
-        </w:pBdr>
-      </w:pPr>
-      <w:r>
-        <w:rPr>
-          <w:b/>
-          <w:color w:val="0B2545"/>
-          <w:sz w:val="26"/>
-        </w:rPr>
-        <w:t>11. Website domain &amp; email</w:t>
-      </w:r>
-    </w:p>
-    <w:tbl>
-      <w:tblPr>
-        <w:tblStyle w:val="TableGrid"/>
-        <w:tblW w:type="auto" w:w="0"/>
-        <w:jc w:val="center"/>
-        <w:tblLook w:firstColumn="1" w:firstRow="1" w:lastColumn="0" w:lastRow="0" w:noHBand="0" w:noVBand="1" w:val="04A0"/>
-      </w:tblPr>
-      <w:tblGrid>
-        <w:gridCol w:w="2550"/>
-        <w:gridCol w:w="2550"/>
-        <w:gridCol w:w="2550"/>
-        <w:gridCol w:w="2550"/>
-      </w:tblGrid>
       <w:tr>
         <w:tc>
           <w:tcPr>
             <w:tcW w:type="dxa" w:w="567"/>
-            <w:shd w:val="clear" w:color="auto" w:fill="0B2545"/>
-          </w:tcPr>
-          <w:p>
-            <w:r/>
-            <w:r>
-              <w:rPr>
-                <w:b/>
-                <w:color w:val="FFFFFF"/>
-                <w:sz w:val="18"/>
-              </w:rPr>
-              <w:t>#</w:t>
+          </w:tcPr>
+          <w:p>
+            <w:r/>
+            <w:r>
+              <w:rPr>
+                <w:sz w:val="19"/>
+              </w:rPr>
+              <w:t>9.6</w:t>
             </w:r>
           </w:p>
         </w:tc>
         <w:tc>
           <w:tcPr>
             <w:tcW w:type="dxa" w:w="3969"/>
-            <w:shd w:val="clear" w:color="auto" w:fill="0B2545"/>
-          </w:tcPr>
-          <w:p>
-            <w:r/>
-            <w:r>
-              <w:rPr>
-                <w:b/>
-                <w:color w:val="FFFFFF"/>
-                <w:sz w:val="18"/>
-              </w:rPr>
-              <w:t>Question</w:t>
-            </w:r>
-          </w:p>
-        </w:tc>
-        <w:tc>
-          <w:tcPr>
-            <w:tcW w:type="dxa" w:w="4082"/>
-            <w:shd w:val="clear" w:color="auto" w:fill="0B2545"/>
-          </w:tcPr>
-          <w:p>
-            <w:r/>
-            <w:r>
-              <w:rPr>
-                <w:b/>
-                <w:color w:val="FFFFFF"/>
-                <w:sz w:val="18"/>
-              </w:rPr>
-              <w:t>Your answer</w:t>
-            </w:r>
-          </w:p>
-        </w:tc>
-        <w:tc>
-          <w:tcPr>
-            <w:tcW w:type="dxa" w:w="1247"/>
-            <w:shd w:val="clear" w:color="auto" w:fill="0B2545"/>
-          </w:tcPr>
-          <w:p>
-            <w:r/>
-            <w:r>
-              <w:rPr>
-                <w:b/>
-                <w:color w:val="FFFFFF"/>
-                <w:sz w:val="18"/>
-              </w:rPr>
-              <w:t>Status</w:t>
-            </w:r>
-          </w:p>
-        </w:tc>
-      </w:tr>
-      <w:tr>
-        <w:tc>
-          <w:tcPr>
-            <w:tcW w:type="dxa" w:w="567"/>
           </w:tcPr>
           <w:p>
             <w:r/>
@@ -5474,435 +5229,7 @@
               <w:rPr>
                 <w:sz w:val="19"/>
               </w:rPr>
-              <w:t>11.1</w:t>
-            </w:r>
-          </w:p>
-        </w:tc>
-        <w:tc>
-          <w:tcPr>
-            <w:tcW w:type="dxa" w:w="3969"/>
-          </w:tcPr>
-          <w:p>
-            <w:r/>
-            <w:r>
-              <w:rPr>
-                <w:sz w:val="19"/>
-              </w:rPr>
-              <w:t>Do you already own babalhidaya.ae or babalhidaya.com? With which company/registrar?</w:t>
-            </w:r>
-          </w:p>
-        </w:tc>
-        <w:tc>
-          <w:tcPr>
-            <w:tcW w:type="dxa" w:w="4082"/>
-            <w:shd w:val="clear" w:color="auto" w:fill="FFFBEA"/>
-          </w:tcPr>
-          <w:p>
-            <w:r/>
-            <w:r>
-              <w:rPr>
-                <w:sz w:val="19"/>
-              </w:rPr>
-            </w:r>
-          </w:p>
-        </w:tc>
-        <w:tc>
-          <w:tcPr>
-            <w:tcW w:type="dxa" w:w="1247"/>
-          </w:tcPr>
-          <w:p>
-            <w:r/>
-            <w:r>
-              <w:rPr>
-                <w:b/>
-                <w:color w:val="B42318"/>
-                <w:sz w:val="18"/>
-              </w:rPr>
-              <w:t>Required</w:t>
-            </w:r>
-          </w:p>
-        </w:tc>
-      </w:tr>
-      <w:tr>
-        <w:tc>
-          <w:tcPr>
-            <w:tcW w:type="dxa" w:w="567"/>
-          </w:tcPr>
-          <w:p>
-            <w:r/>
-            <w:r>
-              <w:rPr>
-                <w:sz w:val="19"/>
-              </w:rPr>
-              <w:t>11.2</w:t>
-            </w:r>
-          </w:p>
-        </w:tc>
-        <w:tc>
-          <w:tcPr>
-            <w:tcW w:type="dxa" w:w="3969"/>
-          </w:tcPr>
-          <w:p>
-            <w:r/>
-            <w:r>
-              <w:rPr>
-                <w:sz w:val="19"/>
-              </w:rPr>
-              <w:t>If not, shall we buy it for you?</w:t>
-            </w:r>
-            <w:r>
-              <w:rPr>
-                <w:i/>
-                <w:color w:val="5A6778"/>
-                <w:sz w:val="16"/>
-              </w:rPr>
-              <w:br/>
-              <w:t>.ae domain requires a copy of the UAE trade licence</w:t>
-            </w:r>
-          </w:p>
-        </w:tc>
-        <w:tc>
-          <w:tcPr>
-            <w:tcW w:type="dxa" w:w="4082"/>
-            <w:shd w:val="clear" w:color="auto" w:fill="FFFBEA"/>
-          </w:tcPr>
-          <w:p>
-            <w:r/>
-            <w:r>
-              <w:rPr>
-                <w:sz w:val="19"/>
-              </w:rPr>
-            </w:r>
-          </w:p>
-        </w:tc>
-        <w:tc>
-          <w:tcPr>
-            <w:tcW w:type="dxa" w:w="1247"/>
-          </w:tcPr>
-          <w:p>
-            <w:r/>
-            <w:r>
-              <w:rPr>
-                <w:b/>
-                <w:color w:val="B42318"/>
-                <w:sz w:val="18"/>
-              </w:rPr>
-              <w:t>Required</w:t>
-            </w:r>
-          </w:p>
-        </w:tc>
-      </w:tr>
-      <w:tr>
-        <w:tc>
-          <w:tcPr>
-            <w:tcW w:type="dxa" w:w="567"/>
-          </w:tcPr>
-          <w:p>
-            <w:r/>
-            <w:r>
-              <w:rPr>
-                <w:sz w:val="19"/>
-              </w:rPr>
-              <w:t>11.3</w:t>
-            </w:r>
-          </w:p>
-        </w:tc>
-        <w:tc>
-          <w:tcPr>
-            <w:tcW w:type="dxa" w:w="3969"/>
-          </w:tcPr>
-          <w:p>
-            <w:r/>
-            <w:r>
-              <w:rPr>
-                <w:sz w:val="19"/>
-              </w:rPr>
-              <w:t>Company email addresses (info@, sales@) on the domain?</w:t>
-            </w:r>
-          </w:p>
-        </w:tc>
-        <w:tc>
-          <w:tcPr>
-            <w:tcW w:type="dxa" w:w="4082"/>
-            <w:shd w:val="clear" w:color="auto" w:fill="FFFBEA"/>
-          </w:tcPr>
-          <w:p>
-            <w:r/>
-            <w:r>
-              <w:rPr>
-                <w:sz w:val="19"/>
-              </w:rPr>
-            </w:r>
-          </w:p>
-        </w:tc>
-        <w:tc>
-          <w:tcPr>
-            <w:tcW w:type="dxa" w:w="1247"/>
-          </w:tcPr>
-          <w:p>
-            <w:r/>
-            <w:r>
-              <w:rPr>
-                <w:b/>
-                <w:color w:val="0F7C74"/>
-                <w:sz w:val="18"/>
-              </w:rPr>
-              <w:t>Optional</w:t>
-            </w:r>
-          </w:p>
-        </w:tc>
-      </w:tr>
-    </w:tbl>
-    <w:p>
-      <w:pPr>
-        <w:spacing w:after="40"/>
-      </w:pPr>
-    </w:p>
-    <w:p>
-      <w:pPr>
-        <w:spacing w:before="280" w:after="80"/>
-        <w:pBdr>
-          <w:bottom w:val="single" w:sz="12" w:space="1" w:color="C9A227"/>
-        </w:pBdr>
-      </w:pPr>
-      <w:r>
-        <w:rPr>
-          <w:b/>
-          <w:color w:val="0B2545"/>
-          <w:sz w:val="26"/>
-        </w:rPr>
-        <w:t>12. Approval</w:t>
-      </w:r>
-    </w:p>
-    <w:tbl>
-      <w:tblPr>
-        <w:tblStyle w:val="TableGrid"/>
-        <w:tblW w:type="auto" w:w="0"/>
-        <w:jc w:val="center"/>
-        <w:tblLook w:firstColumn="1" w:firstRow="1" w:lastColumn="0" w:lastRow="0" w:noHBand="0" w:noVBand="1" w:val="04A0"/>
-      </w:tblPr>
-      <w:tblGrid>
-        <w:gridCol w:w="2550"/>
-        <w:gridCol w:w="2550"/>
-        <w:gridCol w:w="2550"/>
-        <w:gridCol w:w="2550"/>
-      </w:tblGrid>
-      <w:tr>
-        <w:tc>
-          <w:tcPr>
-            <w:tcW w:type="dxa" w:w="567"/>
-            <w:shd w:val="clear" w:color="auto" w:fill="0B2545"/>
-          </w:tcPr>
-          <w:p>
-            <w:r/>
-            <w:r>
-              <w:rPr>
-                <w:b/>
-                <w:color w:val="FFFFFF"/>
-                <w:sz w:val="18"/>
-              </w:rPr>
-              <w:t>#</w:t>
-            </w:r>
-          </w:p>
-        </w:tc>
-        <w:tc>
-          <w:tcPr>
-            <w:tcW w:type="dxa" w:w="3969"/>
-            <w:shd w:val="clear" w:color="auto" w:fill="0B2545"/>
-          </w:tcPr>
-          <w:p>
-            <w:r/>
-            <w:r>
-              <w:rPr>
-                <w:b/>
-                <w:color w:val="FFFFFF"/>
-                <w:sz w:val="18"/>
-              </w:rPr>
-              <w:t>Question</w:t>
-            </w:r>
-          </w:p>
-        </w:tc>
-        <w:tc>
-          <w:tcPr>
-            <w:tcW w:type="dxa" w:w="4082"/>
-            <w:shd w:val="clear" w:color="auto" w:fill="0B2545"/>
-          </w:tcPr>
-          <w:p>
-            <w:r/>
-            <w:r>
-              <w:rPr>
-                <w:b/>
-                <w:color w:val="FFFFFF"/>
-                <w:sz w:val="18"/>
-              </w:rPr>
-              <w:t>Your answer</w:t>
-            </w:r>
-          </w:p>
-        </w:tc>
-        <w:tc>
-          <w:tcPr>
-            <w:tcW w:type="dxa" w:w="1247"/>
-            <w:shd w:val="clear" w:color="auto" w:fill="0B2545"/>
-          </w:tcPr>
-          <w:p>
-            <w:r/>
-            <w:r>
-              <w:rPr>
-                <w:b/>
-                <w:color w:val="FFFFFF"/>
-                <w:sz w:val="18"/>
-              </w:rPr>
-              <w:t>Status</w:t>
-            </w:r>
-          </w:p>
-        </w:tc>
-      </w:tr>
-      <w:tr>
-        <w:tc>
-          <w:tcPr>
-            <w:tcW w:type="dxa" w:w="567"/>
-          </w:tcPr>
-          <w:p>
-            <w:r/>
-            <w:r>
-              <w:rPr>
-                <w:sz w:val="19"/>
-              </w:rPr>
-              <w:t>12.1</w:t>
-            </w:r>
-          </w:p>
-        </w:tc>
-        <w:tc>
-          <w:tcPr>
-            <w:tcW w:type="dxa" w:w="3969"/>
-          </w:tcPr>
-          <w:p>
-            <w:r/>
-            <w:r>
-              <w:rPr>
-                <w:sz w:val="19"/>
-              </w:rPr>
-              <w:t>Who will approve the final website? (name + WhatsApp)</w:t>
-            </w:r>
-          </w:p>
-        </w:tc>
-        <w:tc>
-          <w:tcPr>
-            <w:tcW w:type="dxa" w:w="4082"/>
-            <w:shd w:val="clear" w:color="auto" w:fill="FFFBEA"/>
-          </w:tcPr>
-          <w:p>
-            <w:r/>
-            <w:r>
-              <w:rPr>
-                <w:sz w:val="19"/>
-              </w:rPr>
-            </w:r>
-          </w:p>
-        </w:tc>
-        <w:tc>
-          <w:tcPr>
-            <w:tcW w:type="dxa" w:w="1247"/>
-          </w:tcPr>
-          <w:p>
-            <w:r/>
-            <w:r>
-              <w:rPr>
-                <w:b/>
-                <w:color w:val="B42318"/>
-                <w:sz w:val="18"/>
-              </w:rPr>
-              <w:t>Required</w:t>
-            </w:r>
-          </w:p>
-        </w:tc>
-      </w:tr>
-      <w:tr>
-        <w:tc>
-          <w:tcPr>
-            <w:tcW w:type="dxa" w:w="567"/>
-          </w:tcPr>
-          <w:p>
-            <w:r/>
-            <w:r>
-              <w:rPr>
-                <w:sz w:val="19"/>
-              </w:rPr>
-              <w:t>12.2</w:t>
-            </w:r>
-          </w:p>
-        </w:tc>
-        <w:tc>
-          <w:tcPr>
-            <w:tcW w:type="dxa" w:w="3969"/>
-          </w:tcPr>
-          <w:p>
-            <w:r/>
-            <w:r>
-              <w:rPr>
-                <w:sz w:val="19"/>
-              </w:rPr>
-              <w:t>Who can check the Arabic text? (name + WhatsApp)</w:t>
-            </w:r>
-          </w:p>
-        </w:tc>
-        <w:tc>
-          <w:tcPr>
-            <w:tcW w:type="dxa" w:w="4082"/>
-            <w:shd w:val="clear" w:color="auto" w:fill="FFFBEA"/>
-          </w:tcPr>
-          <w:p>
-            <w:r/>
-            <w:r>
-              <w:rPr>
-                <w:sz w:val="19"/>
-              </w:rPr>
-            </w:r>
-          </w:p>
-        </w:tc>
-        <w:tc>
-          <w:tcPr>
-            <w:tcW w:type="dxa" w:w="1247"/>
-          </w:tcPr>
-          <w:p>
-            <w:r/>
-            <w:r>
-              <w:rPr>
-                <w:b/>
-                <w:color w:val="0F7C74"/>
-                <w:sz w:val="18"/>
-              </w:rPr>
-              <w:t>Optional</w:t>
-            </w:r>
-          </w:p>
-        </w:tc>
-      </w:tr>
-      <w:tr>
-        <w:tc>
-          <w:tcPr>
-            <w:tcW w:type="dxa" w:w="567"/>
-          </w:tcPr>
-          <w:p>
-            <w:r/>
-            <w:r>
-              <w:rPr>
-                <w:sz w:val="19"/>
-              </w:rPr>
-              <w:t>12.3</w:t>
-            </w:r>
-          </w:p>
-        </w:tc>
-        <w:tc>
-          <w:tcPr>
-            <w:tcW w:type="dxa" w:w="3969"/>
-          </w:tcPr>
-          <w:p>
-            <w:r/>
-            <w:r>
-              <w:rPr>
-                <w:sz w:val="19"/>
-              </w:rPr>
-              <w:t>Anything you do NOT want on the website, or special wording you want?</w:t>
+              <w:t>Anything you do NOT want on the website?</w:t>
             </w:r>
           </w:p>
         </w:tc>
@@ -5954,7 +5281,7 @@
           <w:color w:val="5A6778"/>
           <w:sz w:val="18"/>
         </w:rPr>
-        <w:t>Thank you! Once this form is returned, the website will be updated with your real information in English and Arabic and prepared for launch.</w:t>
+        <w:t>Thank you! Once this form is returned, the website will be completed with your real information in English and Arabic and prepared for launch.</w:t>
       </w:r>
     </w:p>
     <w:sectPr>

</xml_diff>